<commit_message>
Refatoração e unificação da lógica de Propostas (Repository, Editor, Email, Relatórios)
</commit_message>
<xml_diff>
--- a/modelos_prod/ModeloPropostaRevisaoeAdequacaodeServico.docx
+++ b/modelos_prod/ModeloPropostaRevisaoeAdequacaodeServico.docx
@@ -4,40 +4,2935 @@
   <w:body>
     <w:p>
       <w:pPr>
-        <w:pStyle w:val="Ttulo1"/>
-        <w:rPr>
-          <w:color w:val="FF0000"/>
+        <w:spacing w:after="100" w:afterAutospacing="1" w:line="240" w:lineRule="auto"/>
+        <w:jc w:val="center"/>
+        <w:outlineLvl w:val="0"/>
+        <w:rPr>
+          <w:rFonts w:ascii="Arial" w:eastAsia="Times New Roman" w:hAnsi="Arial" w:cs="Arial"/>
+          <w:b/>
+          <w:bCs/>
+          <w:kern w:val="36"/>
           <w:sz w:val="48"/>
           <w:szCs w:val="48"/>
-        </w:rPr>
-      </w:pPr>
-      <w:r>
-        <w:rPr>
-          <w:color w:val="FF0000"/>
+          <w:lang w:eastAsia="pt-BR"/>
+          <w14:ligatures w14:val="none"/>
+        </w:rPr>
+      </w:pPr>
+      <w:r>
+        <w:rPr>
+          <w:rFonts w:ascii="Arial" w:eastAsia="Times New Roman" w:hAnsi="Arial" w:cs="Arial"/>
+          <w:b/>
+          <w:bCs/>
+          <w:kern w:val="36"/>
           <w:sz w:val="48"/>
           <w:szCs w:val="48"/>
-        </w:rPr>
-        <w:t>MODELO</w:t>
-      </w:r>
-      <w:r>
-        <w:rPr>
-          <w:color w:val="FF0000"/>
-          <w:sz w:val="48"/>
-          <w:szCs w:val="48"/>
-        </w:rPr>
-        <w:t>P</w:t>
-      </w:r>
-      <w:r>
-        <w:rPr>
-          <w:color w:val="FF0000"/>
-          <w:sz w:val="48"/>
-          <w:szCs w:val="48"/>
-        </w:rPr>
-        <w:t>ROPOSTA EM CONSTRUÇÃO</w:t>
-      </w:r>
+          <w:lang w:eastAsia="pt-BR"/>
+          <w14:ligatures w14:val="none"/>
+        </w:rPr>
+        <w:t>PROPOSTA DE SERVIÇOS TÉCNICOS</w:t>
+      </w:r>
+    </w:p>
+    <w:p>
+      <w:pPr>
+        <w:spacing w:after="100" w:afterAutospacing="1" w:line="240" w:lineRule="auto"/>
+        <w:jc w:val="center"/>
+        <w:outlineLvl w:val="1"/>
+        <w:rPr>
+          <w:rFonts w:ascii="Arial" w:eastAsia="Times New Roman" w:hAnsi="Arial" w:cs="Arial"/>
+          <w:b/>
+          <w:bCs/>
+          <w:kern w:val="0"/>
+          <w:sz w:val="36"/>
+          <w:szCs w:val="36"/>
+          <w:lang w:eastAsia="pt-BR"/>
+          <w14:ligatures w14:val="none"/>
+        </w:rPr>
+      </w:pPr>
+      <w:r>
+        <w:rPr>
+          <w:rFonts w:ascii="Arial" w:eastAsia="Times New Roman" w:hAnsi="Arial" w:cs="Arial"/>
+          <w:b/>
+          <w:bCs/>
+          <w:kern w:val="0"/>
+          <w:sz w:val="36"/>
+          <w:szCs w:val="36"/>
+          <w:lang w:eastAsia="pt-BR"/>
+          <w14:ligatures w14:val="none"/>
+        </w:rPr>
+        <w:t>Adequação e Revisão de Peças Técnicas (Petição de Autoridade)</w:t>
+      </w:r>
+    </w:p>
+    <w:p>
+      <w:pPr>
+        <w:spacing w:after="100" w:afterAutospacing="1" w:line="240" w:lineRule="auto"/>
+        <w:jc w:val="right"/>
+        <w:rPr>
+          <w:rFonts w:ascii="Arial" w:eastAsia="Times New Roman" w:hAnsi="Arial" w:cs="Arial"/>
+          <w:kern w:val="0"/>
+          <w:lang w:eastAsia="pt-BR"/>
+          <w14:ligatures w14:val="none"/>
+        </w:rPr>
+      </w:pPr>
+      <w:r>
+        <w:rPr>
+          <w:rFonts w:ascii="Arial" w:eastAsia="Times New Roman" w:hAnsi="Arial" w:cs="Arial"/>
+          <w:b/>
+          <w:bCs/>
+          <w:kern w:val="0"/>
+          <w:lang w:eastAsia="pt-BR"/>
+          <w14:ligatures w14:val="none"/>
+        </w:rPr>
+        <w:t>Proposta Nº:</w:t>
+      </w:r>
+      <w:r>
+        <w:rPr>
+          <w:rFonts w:ascii="Arial" w:eastAsia="Times New Roman" w:hAnsi="Arial" w:cs="Arial"/>
+          <w:kern w:val="0"/>
+          <w:lang w:eastAsia="pt-BR"/>
+          <w14:ligatures w14:val="none"/>
+        </w:rPr>
+        <w:t xml:space="preserve"> </w:t>
+      </w:r>
+      <w:r>
+        <w:rPr>
+          <w:rFonts w:ascii="Arial" w:eastAsia="Times New Roman" w:hAnsi="Arial" w:cs="Arial"/>
+          <w:kern w:val="0"/>
+          <w:sz w:val="20"/>
+          <w:szCs w:val="20"/>
+          <w:lang w:eastAsia="pt-BR"/>
+          <w14:ligatures w14:val="none"/>
+        </w:rPr>
+        <w:t>${</w:t>
+      </w:r>
+      <w:proofErr w:type="spellStart"/>
+      <w:r>
+        <w:rPr>
+          <w:rFonts w:ascii="Arial" w:eastAsia="Times New Roman" w:hAnsi="Arial" w:cs="Arial"/>
+          <w:kern w:val="0"/>
+          <w:sz w:val="20"/>
+          <w:szCs w:val="20"/>
+          <w:lang w:eastAsia="pt-BR"/>
+          <w14:ligatures w14:val="none"/>
+        </w:rPr>
+        <w:t>numero_proposta</w:t>
+      </w:r>
+      <w:proofErr w:type="spellEnd"/>
+      <w:r>
+        <w:rPr>
+          <w:rFonts w:ascii="Arial" w:eastAsia="Times New Roman" w:hAnsi="Arial" w:cs="Arial"/>
+          <w:kern w:val="0"/>
+          <w:sz w:val="20"/>
+          <w:szCs w:val="20"/>
+          <w:lang w:eastAsia="pt-BR"/>
+          <w14:ligatures w14:val="none"/>
+        </w:rPr>
+        <w:t>}</w:t>
+      </w:r>
+      <w:r>
+        <w:rPr>
+          <w:rFonts w:ascii="Arial" w:eastAsia="Times New Roman" w:hAnsi="Arial" w:cs="Arial"/>
+          <w:kern w:val="0"/>
+          <w:lang w:eastAsia="pt-BR"/>
+          <w14:ligatures w14:val="none"/>
+        </w:rPr>
+        <w:t xml:space="preserve"> </w:t>
+      </w:r>
+    </w:p>
+    <w:p>
+      <w:pPr>
+        <w:spacing w:after="100" w:afterAutospacing="1" w:line="240" w:lineRule="auto"/>
+        <w:rPr>
+          <w:rFonts w:ascii="Arial" w:eastAsia="Times New Roman" w:hAnsi="Arial" w:cs="Arial"/>
+          <w:kern w:val="0"/>
+          <w:lang w:eastAsia="pt-BR"/>
+          <w14:ligatures w14:val="none"/>
+        </w:rPr>
+      </w:pPr>
+      <w:r>
+        <w:rPr>
+          <w:rFonts w:ascii="Arial" w:eastAsia="Times New Roman" w:hAnsi="Arial" w:cs="Arial"/>
+          <w:kern w:val="0"/>
+          <w:sz w:val="20"/>
+          <w:szCs w:val="20"/>
+          <w:lang w:eastAsia="pt-BR"/>
+          <w14:ligatures w14:val="none"/>
+        </w:rPr>
+        <w:t>${Cidade}</w:t>
+      </w:r>
+      <w:r>
+        <w:rPr>
+          <w:rFonts w:ascii="Arial" w:eastAsia="Times New Roman" w:hAnsi="Arial" w:cs="Arial"/>
+          <w:kern w:val="0"/>
+          <w:lang w:eastAsia="pt-BR"/>
+          <w14:ligatures w14:val="none"/>
+        </w:rPr>
+        <w:t xml:space="preserve">, </w:t>
+      </w:r>
+      <w:r>
+        <w:rPr>
+          <w:rFonts w:ascii="Arial" w:eastAsia="Times New Roman" w:hAnsi="Arial" w:cs="Arial"/>
+          <w:kern w:val="0"/>
+          <w:sz w:val="20"/>
+          <w:szCs w:val="20"/>
+          <w:lang w:eastAsia="pt-BR"/>
+          <w14:ligatures w14:val="none"/>
+        </w:rPr>
+        <w:t>${</w:t>
+      </w:r>
+      <w:proofErr w:type="spellStart"/>
+      <w:r>
+        <w:rPr>
+          <w:rFonts w:ascii="Arial" w:eastAsia="Times New Roman" w:hAnsi="Arial" w:cs="Arial"/>
+          <w:kern w:val="0"/>
+          <w:sz w:val="20"/>
+          <w:szCs w:val="20"/>
+          <w:lang w:eastAsia="pt-BR"/>
+          <w14:ligatures w14:val="none"/>
+        </w:rPr>
+        <w:t>DataExtenso</w:t>
+      </w:r>
+      <w:proofErr w:type="spellEnd"/>
+      <w:r>
+        <w:rPr>
+          <w:rFonts w:ascii="Arial" w:eastAsia="Times New Roman" w:hAnsi="Arial" w:cs="Arial"/>
+          <w:kern w:val="0"/>
+          <w:sz w:val="20"/>
+          <w:szCs w:val="20"/>
+          <w:lang w:eastAsia="pt-BR"/>
+          <w14:ligatures w14:val="none"/>
+        </w:rPr>
+        <w:t>}</w:t>
+      </w:r>
+      <w:r>
+        <w:rPr>
+          <w:rFonts w:ascii="Arial" w:eastAsia="Times New Roman" w:hAnsi="Arial" w:cs="Arial"/>
+          <w:kern w:val="0"/>
+          <w:lang w:eastAsia="pt-BR"/>
+          <w14:ligatures w14:val="none"/>
+        </w:rPr>
+        <w:t xml:space="preserve"> </w:t>
+      </w:r>
+    </w:p>
+    <w:p>
+      <w:pPr>
+        <w:spacing w:after="100" w:afterAutospacing="1" w:line="240" w:lineRule="auto"/>
+        <w:rPr>
+          <w:rFonts w:ascii="Arial" w:eastAsia="Times New Roman" w:hAnsi="Arial" w:cs="Arial"/>
+          <w:kern w:val="0"/>
+          <w:lang w:eastAsia="pt-BR"/>
+          <w14:ligatures w14:val="none"/>
+        </w:rPr>
+      </w:pPr>
+    </w:p>
+    <w:p>
+      <w:pPr>
+        <w:spacing w:after="100" w:afterAutospacing="1" w:line="240" w:lineRule="auto"/>
+        <w:outlineLvl w:val="2"/>
+        <w:rPr>
+          <w:rFonts w:ascii="Arial" w:eastAsia="Times New Roman" w:hAnsi="Arial" w:cs="Arial"/>
+          <w:b/>
+          <w:bCs/>
+          <w:kern w:val="0"/>
+          <w:sz w:val="27"/>
+          <w:szCs w:val="27"/>
+          <w:lang w:eastAsia="pt-BR"/>
+          <w14:ligatures w14:val="none"/>
+        </w:rPr>
+      </w:pPr>
+      <w:r>
+        <w:rPr>
+          <w:rFonts w:ascii="Arial" w:eastAsia="Times New Roman" w:hAnsi="Arial" w:cs="Arial"/>
+          <w:b/>
+          <w:bCs/>
+          <w:kern w:val="0"/>
+          <w:sz w:val="27"/>
+          <w:szCs w:val="27"/>
+          <w:lang w:eastAsia="pt-BR"/>
+          <w14:ligatures w14:val="none"/>
+        </w:rPr>
+        <w:t>1. Dados do Cliente</w:t>
+      </w:r>
+    </w:p>
+    <w:p>
+      <w:pPr>
+        <w:numPr>
+          <w:ilvl w:val="0"/>
+          <w:numId w:val="1"/>
+        </w:numPr>
+        <w:spacing w:after="100" w:afterAutospacing="1" w:line="360" w:lineRule="auto"/>
+        <w:rPr>
+          <w:rFonts w:ascii="Arial" w:eastAsia="Times New Roman" w:hAnsi="Arial" w:cs="Arial"/>
+          <w:kern w:val="0"/>
+          <w:lang w:eastAsia="pt-BR"/>
+          <w14:ligatures w14:val="none"/>
+        </w:rPr>
+      </w:pPr>
+      <w:r>
+        <w:rPr>
+          <w:rFonts w:ascii="Arial" w:eastAsia="Times New Roman" w:hAnsi="Arial" w:cs="Arial"/>
+          <w:b/>
+          <w:bCs/>
+          <w:kern w:val="0"/>
+          <w:lang w:eastAsia="pt-BR"/>
+          <w14:ligatures w14:val="none"/>
+        </w:rPr>
+        <w:t>Nome/Razão Social:</w:t>
+      </w:r>
+      <w:r>
+        <w:rPr>
+          <w:rFonts w:ascii="Arial" w:eastAsia="Times New Roman" w:hAnsi="Arial" w:cs="Arial"/>
+          <w:kern w:val="0"/>
+          <w:lang w:eastAsia="pt-BR"/>
+          <w14:ligatures w14:val="none"/>
+        </w:rPr>
+        <w:t xml:space="preserve"> </w:t>
+      </w:r>
+      <w:r>
+        <w:rPr>
+          <w:rFonts w:ascii="Arial" w:eastAsia="Times New Roman" w:hAnsi="Arial" w:cs="Arial"/>
+          <w:kern w:val="0"/>
+          <w:sz w:val="20"/>
+          <w:szCs w:val="20"/>
+          <w:lang w:eastAsia="pt-BR"/>
+          <w14:ligatures w14:val="none"/>
+        </w:rPr>
+        <w:t>${</w:t>
+      </w:r>
+      <w:proofErr w:type="spellStart"/>
+      <w:r>
+        <w:rPr>
+          <w:rFonts w:ascii="Arial" w:eastAsia="Times New Roman" w:hAnsi="Arial" w:cs="Arial"/>
+          <w:kern w:val="0"/>
+          <w:sz w:val="20"/>
+          <w:szCs w:val="20"/>
+          <w:lang w:eastAsia="pt-BR"/>
+          <w14:ligatures w14:val="none"/>
+        </w:rPr>
+        <w:t>nome_cliente_salvo</w:t>
+      </w:r>
+      <w:proofErr w:type="spellEnd"/>
+      <w:r>
+        <w:rPr>
+          <w:rFonts w:ascii="Arial" w:eastAsia="Times New Roman" w:hAnsi="Arial" w:cs="Arial"/>
+          <w:kern w:val="0"/>
+          <w:sz w:val="20"/>
+          <w:szCs w:val="20"/>
+          <w:lang w:eastAsia="pt-BR"/>
+          <w14:ligatures w14:val="none"/>
+        </w:rPr>
+        <w:t>}</w:t>
+      </w:r>
+      <w:r>
+        <w:rPr>
+          <w:rFonts w:ascii="Arial" w:eastAsia="Times New Roman" w:hAnsi="Arial" w:cs="Arial"/>
+          <w:kern w:val="0"/>
+          <w:lang w:eastAsia="pt-BR"/>
+          <w14:ligatures w14:val="none"/>
+        </w:rPr>
+        <w:t xml:space="preserve"> </w:t>
+      </w:r>
+    </w:p>
+    <w:p>
+      <w:pPr>
+        <w:numPr>
+          <w:ilvl w:val="0"/>
+          <w:numId w:val="1"/>
+        </w:numPr>
+        <w:spacing w:after="100" w:afterAutospacing="1" w:line="360" w:lineRule="auto"/>
+        <w:rPr>
+          <w:rFonts w:ascii="Arial" w:eastAsia="Times New Roman" w:hAnsi="Arial" w:cs="Arial"/>
+          <w:kern w:val="0"/>
+          <w:lang w:eastAsia="pt-BR"/>
+          <w14:ligatures w14:val="none"/>
+        </w:rPr>
+      </w:pPr>
+      <w:r>
+        <w:rPr>
+          <w:rFonts w:ascii="Arial" w:eastAsia="Times New Roman" w:hAnsi="Arial" w:cs="Arial"/>
+          <w:b/>
+          <w:bCs/>
+          <w:kern w:val="0"/>
+          <w:lang w:eastAsia="pt-BR"/>
+          <w14:ligatures w14:val="none"/>
+        </w:rPr>
+        <w:t>E-mail:</w:t>
+      </w:r>
+      <w:r>
+        <w:rPr>
+          <w:rFonts w:ascii="Arial" w:eastAsia="Times New Roman" w:hAnsi="Arial" w:cs="Arial"/>
+          <w:kern w:val="0"/>
+          <w:lang w:eastAsia="pt-BR"/>
+          <w14:ligatures w14:val="none"/>
+        </w:rPr>
+        <w:t xml:space="preserve"> </w:t>
+      </w:r>
+      <w:r>
+        <w:rPr>
+          <w:rFonts w:ascii="Arial" w:eastAsia="Times New Roman" w:hAnsi="Arial" w:cs="Arial"/>
+          <w:kern w:val="0"/>
+          <w:sz w:val="20"/>
+          <w:szCs w:val="20"/>
+          <w:lang w:eastAsia="pt-BR"/>
+          <w14:ligatures w14:val="none"/>
+        </w:rPr>
+        <w:t>${</w:t>
+      </w:r>
+      <w:proofErr w:type="spellStart"/>
+      <w:r>
+        <w:rPr>
+          <w:rFonts w:ascii="Arial" w:eastAsia="Times New Roman" w:hAnsi="Arial" w:cs="Arial"/>
+          <w:kern w:val="0"/>
+          <w:sz w:val="20"/>
+          <w:szCs w:val="20"/>
+          <w:lang w:eastAsia="pt-BR"/>
+          <w14:ligatures w14:val="none"/>
+        </w:rPr>
+        <w:t>email_salvo</w:t>
+      </w:r>
+      <w:proofErr w:type="spellEnd"/>
+      <w:r>
+        <w:rPr>
+          <w:rFonts w:ascii="Arial" w:eastAsia="Times New Roman" w:hAnsi="Arial" w:cs="Arial"/>
+          <w:kern w:val="0"/>
+          <w:sz w:val="20"/>
+          <w:szCs w:val="20"/>
+          <w:lang w:eastAsia="pt-BR"/>
+          <w14:ligatures w14:val="none"/>
+        </w:rPr>
+        <w:t>}</w:t>
+      </w:r>
+      <w:r>
+        <w:rPr>
+          <w:rFonts w:ascii="Arial" w:eastAsia="Times New Roman" w:hAnsi="Arial" w:cs="Arial"/>
+          <w:kern w:val="0"/>
+          <w:lang w:eastAsia="pt-BR"/>
+          <w14:ligatures w14:val="none"/>
+        </w:rPr>
+        <w:t xml:space="preserve"> </w:t>
+      </w:r>
+    </w:p>
+    <w:p>
+      <w:pPr>
+        <w:numPr>
+          <w:ilvl w:val="0"/>
+          <w:numId w:val="1"/>
+        </w:numPr>
+        <w:spacing w:after="100" w:afterAutospacing="1" w:line="360" w:lineRule="auto"/>
+        <w:rPr>
+          <w:rFonts w:ascii="Arial" w:eastAsia="Times New Roman" w:hAnsi="Arial" w:cs="Arial"/>
+          <w:kern w:val="0"/>
+          <w:lang w:eastAsia="pt-BR"/>
+          <w14:ligatures w14:val="none"/>
+        </w:rPr>
+      </w:pPr>
+      <w:r>
+        <w:rPr>
+          <w:rFonts w:ascii="Arial" w:eastAsia="Times New Roman" w:hAnsi="Arial" w:cs="Arial"/>
+          <w:b/>
+          <w:bCs/>
+          <w:kern w:val="0"/>
+          <w:lang w:eastAsia="pt-BR"/>
+          <w14:ligatures w14:val="none"/>
+        </w:rPr>
+        <w:t>WhatsApp:</w:t>
+      </w:r>
+      <w:r>
+        <w:rPr>
+          <w:rFonts w:ascii="Arial" w:eastAsia="Times New Roman" w:hAnsi="Arial" w:cs="Arial"/>
+          <w:kern w:val="0"/>
+          <w:lang w:eastAsia="pt-BR"/>
+          <w14:ligatures w14:val="none"/>
+        </w:rPr>
+        <w:t xml:space="preserve"> </w:t>
+      </w:r>
+      <w:r>
+        <w:rPr>
+          <w:rFonts w:ascii="Arial" w:eastAsia="Times New Roman" w:hAnsi="Arial" w:cs="Arial"/>
+          <w:kern w:val="0"/>
+          <w:sz w:val="20"/>
+          <w:szCs w:val="20"/>
+          <w:lang w:eastAsia="pt-BR"/>
+          <w14:ligatures w14:val="none"/>
+        </w:rPr>
+        <w:t>${</w:t>
+      </w:r>
+      <w:proofErr w:type="spellStart"/>
+      <w:r>
+        <w:rPr>
+          <w:rFonts w:ascii="Arial" w:eastAsia="Times New Roman" w:hAnsi="Arial" w:cs="Arial"/>
+          <w:kern w:val="0"/>
+          <w:sz w:val="20"/>
+          <w:szCs w:val="20"/>
+          <w:lang w:eastAsia="pt-BR"/>
+          <w14:ligatures w14:val="none"/>
+        </w:rPr>
+        <w:t>whatsapp_salvo</w:t>
+      </w:r>
+      <w:proofErr w:type="spellEnd"/>
+      <w:r>
+        <w:rPr>
+          <w:rFonts w:ascii="Arial" w:eastAsia="Times New Roman" w:hAnsi="Arial" w:cs="Arial"/>
+          <w:kern w:val="0"/>
+          <w:sz w:val="20"/>
+          <w:szCs w:val="20"/>
+          <w:lang w:eastAsia="pt-BR"/>
+          <w14:ligatures w14:val="none"/>
+        </w:rPr>
+        <w:t>}</w:t>
+      </w:r>
+      <w:r>
+        <w:rPr>
+          <w:rFonts w:ascii="Arial" w:eastAsia="Times New Roman" w:hAnsi="Arial" w:cs="Arial"/>
+          <w:kern w:val="0"/>
+          <w:lang w:eastAsia="pt-BR"/>
+          <w14:ligatures w14:val="none"/>
+        </w:rPr>
+        <w:t xml:space="preserve"> </w:t>
+      </w:r>
+    </w:p>
+    <w:p>
+      <w:pPr>
+        <w:spacing w:after="100" w:afterAutospacing="1" w:line="240" w:lineRule="auto"/>
+        <w:outlineLvl w:val="2"/>
+        <w:rPr>
+          <w:rFonts w:ascii="Arial" w:eastAsia="Times New Roman" w:hAnsi="Arial" w:cs="Arial"/>
+          <w:b/>
+          <w:bCs/>
+          <w:kern w:val="0"/>
+          <w:sz w:val="27"/>
+          <w:szCs w:val="27"/>
+          <w:lang w:eastAsia="pt-BR"/>
+          <w14:ligatures w14:val="none"/>
+        </w:rPr>
+      </w:pPr>
+      <w:r>
+        <w:rPr>
+          <w:rFonts w:ascii="Arial" w:eastAsia="Times New Roman" w:hAnsi="Arial" w:cs="Arial"/>
+          <w:b/>
+          <w:bCs/>
+          <w:kern w:val="0"/>
+          <w:sz w:val="27"/>
+          <w:szCs w:val="27"/>
+          <w:lang w:eastAsia="pt-BR"/>
+          <w14:ligatures w14:val="none"/>
+        </w:rPr>
+        <w:t>2. Localização do Imóvel</w:t>
+      </w:r>
+    </w:p>
+    <w:p>
+      <w:pPr>
+        <w:numPr>
+          <w:ilvl w:val="0"/>
+          <w:numId w:val="2"/>
+        </w:numPr>
+        <w:spacing w:after="100" w:afterAutospacing="1" w:line="360" w:lineRule="auto"/>
+        <w:rPr>
+          <w:rFonts w:ascii="Arial" w:eastAsia="Times New Roman" w:hAnsi="Arial" w:cs="Arial"/>
+          <w:kern w:val="0"/>
+          <w:lang w:eastAsia="pt-BR"/>
+          <w14:ligatures w14:val="none"/>
+        </w:rPr>
+      </w:pPr>
+      <w:r>
+        <w:rPr>
+          <w:rFonts w:ascii="Arial" w:eastAsia="Times New Roman" w:hAnsi="Arial" w:cs="Arial"/>
+          <w:b/>
+          <w:bCs/>
+          <w:kern w:val="0"/>
+          <w:lang w:eastAsia="pt-BR"/>
+          <w14:ligatures w14:val="none"/>
+        </w:rPr>
+        <w:t>Endereço:</w:t>
+      </w:r>
+      <w:r>
+        <w:rPr>
+          <w:rFonts w:ascii="Arial" w:eastAsia="Times New Roman" w:hAnsi="Arial" w:cs="Arial"/>
+          <w:kern w:val="0"/>
+          <w:lang w:eastAsia="pt-BR"/>
+          <w14:ligatures w14:val="none"/>
+        </w:rPr>
+        <w:t xml:space="preserve"> </w:t>
+      </w:r>
+      <w:r>
+        <w:rPr>
+          <w:rFonts w:ascii="Arial" w:eastAsia="Times New Roman" w:hAnsi="Arial" w:cs="Arial"/>
+          <w:kern w:val="0"/>
+          <w:sz w:val="20"/>
+          <w:szCs w:val="20"/>
+          <w:lang w:eastAsia="pt-BR"/>
+          <w14:ligatures w14:val="none"/>
+        </w:rPr>
+        <w:t>${</w:t>
+      </w:r>
+      <w:proofErr w:type="spellStart"/>
+      <w:r>
+        <w:rPr>
+          <w:rFonts w:ascii="Arial" w:eastAsia="Times New Roman" w:hAnsi="Arial" w:cs="Arial"/>
+          <w:kern w:val="0"/>
+          <w:sz w:val="20"/>
+          <w:szCs w:val="20"/>
+          <w:lang w:eastAsia="pt-BR"/>
+          <w14:ligatures w14:val="none"/>
+        </w:rPr>
+        <w:t>endereco_obra</w:t>
+      </w:r>
+      <w:proofErr w:type="spellEnd"/>
+      <w:r>
+        <w:rPr>
+          <w:rFonts w:ascii="Arial" w:eastAsia="Times New Roman" w:hAnsi="Arial" w:cs="Arial"/>
+          <w:kern w:val="0"/>
+          <w:sz w:val="20"/>
+          <w:szCs w:val="20"/>
+          <w:lang w:eastAsia="pt-BR"/>
+          <w14:ligatures w14:val="none"/>
+        </w:rPr>
+        <w:t>}</w:t>
+      </w:r>
+      <w:r>
+        <w:rPr>
+          <w:rFonts w:ascii="Arial" w:eastAsia="Times New Roman" w:hAnsi="Arial" w:cs="Arial"/>
+          <w:kern w:val="0"/>
+          <w:lang w:eastAsia="pt-BR"/>
+          <w14:ligatures w14:val="none"/>
+        </w:rPr>
+        <w:t xml:space="preserve"> </w:t>
+      </w:r>
+    </w:p>
+    <w:p>
+      <w:pPr>
+        <w:numPr>
+          <w:ilvl w:val="0"/>
+          <w:numId w:val="2"/>
+        </w:numPr>
+        <w:spacing w:after="100" w:afterAutospacing="1" w:line="360" w:lineRule="auto"/>
+        <w:rPr>
+          <w:rFonts w:ascii="Arial" w:eastAsia="Times New Roman" w:hAnsi="Arial" w:cs="Arial"/>
+          <w:kern w:val="0"/>
+          <w:lang w:eastAsia="pt-BR"/>
+          <w14:ligatures w14:val="none"/>
+        </w:rPr>
+      </w:pPr>
+      <w:r>
+        <w:rPr>
+          <w:rFonts w:ascii="Arial" w:eastAsia="Times New Roman" w:hAnsi="Arial" w:cs="Arial"/>
+          <w:b/>
+          <w:bCs/>
+          <w:kern w:val="0"/>
+          <w:lang w:eastAsia="pt-BR"/>
+          <w14:ligatures w14:val="none"/>
+        </w:rPr>
+        <w:t>Bairro:</w:t>
+      </w:r>
+      <w:r>
+        <w:rPr>
+          <w:rFonts w:ascii="Arial" w:eastAsia="Times New Roman" w:hAnsi="Arial" w:cs="Arial"/>
+          <w:kern w:val="0"/>
+          <w:lang w:eastAsia="pt-BR"/>
+          <w14:ligatures w14:val="none"/>
+        </w:rPr>
+        <w:t xml:space="preserve"> </w:t>
+      </w:r>
+      <w:r>
+        <w:rPr>
+          <w:rFonts w:ascii="Arial" w:eastAsia="Times New Roman" w:hAnsi="Arial" w:cs="Arial"/>
+          <w:kern w:val="0"/>
+          <w:sz w:val="20"/>
+          <w:szCs w:val="20"/>
+          <w:lang w:eastAsia="pt-BR"/>
+          <w14:ligatures w14:val="none"/>
+        </w:rPr>
+        <w:t>${</w:t>
+      </w:r>
+      <w:proofErr w:type="spellStart"/>
+      <w:r>
+        <w:rPr>
+          <w:rFonts w:ascii="Arial" w:eastAsia="Times New Roman" w:hAnsi="Arial" w:cs="Arial"/>
+          <w:kern w:val="0"/>
+          <w:sz w:val="20"/>
+          <w:szCs w:val="20"/>
+          <w:lang w:eastAsia="pt-BR"/>
+          <w14:ligatures w14:val="none"/>
+        </w:rPr>
+        <w:t>bairro_obra</w:t>
+      </w:r>
+      <w:proofErr w:type="spellEnd"/>
+      <w:r>
+        <w:rPr>
+          <w:rFonts w:ascii="Arial" w:eastAsia="Times New Roman" w:hAnsi="Arial" w:cs="Arial"/>
+          <w:kern w:val="0"/>
+          <w:sz w:val="20"/>
+          <w:szCs w:val="20"/>
+          <w:lang w:eastAsia="pt-BR"/>
+          <w14:ligatures w14:val="none"/>
+        </w:rPr>
+        <w:t>}</w:t>
+      </w:r>
+      <w:r>
+        <w:rPr>
+          <w:rFonts w:ascii="Arial" w:eastAsia="Times New Roman" w:hAnsi="Arial" w:cs="Arial"/>
+          <w:kern w:val="0"/>
+          <w:lang w:eastAsia="pt-BR"/>
+          <w14:ligatures w14:val="none"/>
+        </w:rPr>
+        <w:t xml:space="preserve"> </w:t>
+      </w:r>
+    </w:p>
+    <w:p>
+      <w:pPr>
+        <w:numPr>
+          <w:ilvl w:val="0"/>
+          <w:numId w:val="2"/>
+        </w:numPr>
+        <w:spacing w:after="100" w:afterAutospacing="1" w:line="360" w:lineRule="auto"/>
+        <w:rPr>
+          <w:rFonts w:ascii="Arial" w:eastAsia="Times New Roman" w:hAnsi="Arial" w:cs="Arial"/>
+          <w:kern w:val="0"/>
+          <w:lang w:eastAsia="pt-BR"/>
+          <w14:ligatures w14:val="none"/>
+        </w:rPr>
+      </w:pPr>
+      <w:r>
+        <w:rPr>
+          <w:rFonts w:ascii="Arial" w:eastAsia="Times New Roman" w:hAnsi="Arial" w:cs="Arial"/>
+          <w:b/>
+          <w:bCs/>
+          <w:kern w:val="0"/>
+          <w:lang w:eastAsia="pt-BR"/>
+          <w14:ligatures w14:val="none"/>
+        </w:rPr>
+        <w:t>Cidade/UF:</w:t>
+      </w:r>
+      <w:r>
+        <w:rPr>
+          <w:rFonts w:ascii="Arial" w:eastAsia="Times New Roman" w:hAnsi="Arial" w:cs="Arial"/>
+          <w:kern w:val="0"/>
+          <w:lang w:eastAsia="pt-BR"/>
+          <w14:ligatures w14:val="none"/>
+        </w:rPr>
+        <w:t xml:space="preserve"> </w:t>
+      </w:r>
+      <w:r>
+        <w:rPr>
+          <w:rFonts w:ascii="Arial" w:eastAsia="Times New Roman" w:hAnsi="Arial" w:cs="Arial"/>
+          <w:kern w:val="0"/>
+          <w:sz w:val="20"/>
+          <w:szCs w:val="20"/>
+          <w:lang w:eastAsia="pt-BR"/>
+          <w14:ligatures w14:val="none"/>
+        </w:rPr>
+        <w:t>${</w:t>
+      </w:r>
+      <w:proofErr w:type="spellStart"/>
+      <w:r>
+        <w:rPr>
+          <w:rFonts w:ascii="Arial" w:eastAsia="Times New Roman" w:hAnsi="Arial" w:cs="Arial"/>
+          <w:kern w:val="0"/>
+          <w:sz w:val="20"/>
+          <w:szCs w:val="20"/>
+          <w:lang w:eastAsia="pt-BR"/>
+          <w14:ligatures w14:val="none"/>
+        </w:rPr>
+        <w:t>ClienteCidadeUF</w:t>
+      </w:r>
+      <w:proofErr w:type="spellEnd"/>
+      <w:r>
+        <w:rPr>
+          <w:rFonts w:ascii="Arial" w:eastAsia="Times New Roman" w:hAnsi="Arial" w:cs="Arial"/>
+          <w:kern w:val="0"/>
+          <w:sz w:val="20"/>
+          <w:szCs w:val="20"/>
+          <w:lang w:eastAsia="pt-BR"/>
+          <w14:ligatures w14:val="none"/>
+        </w:rPr>
+        <w:t>}</w:t>
+      </w:r>
+      <w:r>
+        <w:rPr>
+          <w:rFonts w:ascii="Arial" w:eastAsia="Times New Roman" w:hAnsi="Arial" w:cs="Arial"/>
+          <w:kern w:val="0"/>
+          <w:lang w:eastAsia="pt-BR"/>
+          <w14:ligatures w14:val="none"/>
+        </w:rPr>
+        <w:t xml:space="preserve"> </w:t>
+      </w:r>
+    </w:p>
+    <w:p>
+      <w:pPr>
+        <w:spacing w:after="100" w:afterAutospacing="1" w:line="240" w:lineRule="auto"/>
+        <w:outlineLvl w:val="2"/>
+        <w:rPr>
+          <w:rFonts w:ascii="Arial" w:eastAsia="Times New Roman" w:hAnsi="Arial" w:cs="Arial"/>
+          <w:b/>
+          <w:bCs/>
+          <w:kern w:val="0"/>
+          <w:sz w:val="27"/>
+          <w:szCs w:val="27"/>
+          <w:lang w:eastAsia="pt-BR"/>
+          <w14:ligatures w14:val="none"/>
+        </w:rPr>
+      </w:pPr>
+      <w:r>
+        <w:rPr>
+          <w:rFonts w:ascii="Arial" w:eastAsia="Times New Roman" w:hAnsi="Arial" w:cs="Arial"/>
+          <w:b/>
+          <w:bCs/>
+          <w:kern w:val="0"/>
+          <w:sz w:val="27"/>
+          <w:szCs w:val="27"/>
+          <w:lang w:eastAsia="pt-BR"/>
+          <w14:ligatures w14:val="none"/>
+        </w:rPr>
+        <w:t>3. Apresentação</w:t>
+      </w:r>
+    </w:p>
+    <w:p>
+      <w:pPr>
+        <w:spacing w:after="100" w:afterAutospacing="1" w:line="240" w:lineRule="auto"/>
+        <w:rPr>
+          <w:rFonts w:ascii="Arial" w:eastAsia="Times New Roman" w:hAnsi="Arial" w:cs="Arial"/>
+          <w:kern w:val="0"/>
+          <w:lang w:eastAsia="pt-BR"/>
+          <w14:ligatures w14:val="none"/>
+        </w:rPr>
+      </w:pPr>
+      <w:r>
+        <w:rPr>
+          <w:rFonts w:ascii="Arial" w:eastAsia="Times New Roman" w:hAnsi="Arial" w:cs="Arial"/>
+          <w:kern w:val="0"/>
+          <w:lang w:eastAsia="pt-BR"/>
+          <w14:ligatures w14:val="none"/>
+        </w:rPr>
+        <w:t xml:space="preserve">A </w:t>
+      </w:r>
+      <w:r>
+        <w:rPr>
+          <w:rFonts w:ascii="Arial" w:eastAsia="Times New Roman" w:hAnsi="Arial" w:cs="Arial"/>
+          <w:kern w:val="0"/>
+          <w:sz w:val="20"/>
+          <w:szCs w:val="20"/>
+          <w:lang w:eastAsia="pt-BR"/>
+          <w14:ligatures w14:val="none"/>
+        </w:rPr>
+        <w:t>${Empresa}</w:t>
+      </w:r>
+      <w:r>
+        <w:rPr>
+          <w:rFonts w:ascii="Arial" w:eastAsia="Times New Roman" w:hAnsi="Arial" w:cs="Arial"/>
+          <w:kern w:val="0"/>
+          <w:lang w:eastAsia="pt-BR"/>
+          <w14:ligatures w14:val="none"/>
+        </w:rPr>
+        <w:t xml:space="preserve"> é uma empresa prestadora de serviços técnicos especializada em Engenharia de Agrimensura e Topografia. Nosso foco é a elaboração precisa de peças técnicas (plantas, memoriais e laudos) que servem como base física para processos de regularização. Com vasta experiência e histórico sólido de projetos, garantimos segurança e exatidão em cada medição e revisão.</w:t>
+      </w:r>
+    </w:p>
+    <w:p>
+      <w:pPr>
+        <w:spacing w:after="0" w:line="240" w:lineRule="auto"/>
+        <w:rPr>
+          <w:rFonts w:ascii="Arial" w:eastAsia="Times New Roman" w:hAnsi="Arial" w:cs="Arial"/>
+          <w:kern w:val="0"/>
+          <w:lang w:eastAsia="pt-BR"/>
+          <w14:ligatures w14:val="none"/>
+        </w:rPr>
+      </w:pPr>
+    </w:p>
+    <w:p>
+      <w:pPr>
+        <w:spacing w:after="100" w:afterAutospacing="1" w:line="240" w:lineRule="auto"/>
+        <w:outlineLvl w:val="2"/>
+        <w:rPr>
+          <w:rFonts w:ascii="Arial" w:eastAsia="Times New Roman" w:hAnsi="Arial" w:cs="Arial"/>
+          <w:b/>
+          <w:bCs/>
+          <w:kern w:val="0"/>
+          <w:sz w:val="27"/>
+          <w:szCs w:val="27"/>
+          <w:lang w:eastAsia="pt-BR"/>
+          <w14:ligatures w14:val="none"/>
+        </w:rPr>
+      </w:pPr>
+      <w:r>
+        <w:rPr>
+          <w:rFonts w:ascii="Arial" w:eastAsia="Times New Roman" w:hAnsi="Arial" w:cs="Arial"/>
+          <w:b/>
+          <w:bCs/>
+          <w:kern w:val="0"/>
+          <w:sz w:val="27"/>
+          <w:szCs w:val="27"/>
+          <w:lang w:eastAsia="pt-BR"/>
+          <w14:ligatures w14:val="none"/>
+        </w:rPr>
+        <w:t>4. Objeto e Finalidade</w:t>
+      </w:r>
+    </w:p>
+    <w:p>
+      <w:pPr>
+        <w:spacing w:after="100" w:afterAutospacing="1" w:line="240" w:lineRule="auto"/>
+        <w:rPr>
+          <w:rFonts w:ascii="Arial" w:eastAsia="Times New Roman" w:hAnsi="Arial" w:cs="Arial"/>
+          <w:kern w:val="0"/>
+          <w:lang w:eastAsia="pt-BR"/>
+          <w14:ligatures w14:val="none"/>
+        </w:rPr>
+      </w:pPr>
+      <w:r>
+        <w:rPr>
+          <w:rFonts w:ascii="Arial" w:eastAsia="Times New Roman" w:hAnsi="Arial" w:cs="Arial"/>
+          <w:kern w:val="0"/>
+          <w:lang w:eastAsia="pt-BR"/>
+          <w14:ligatures w14:val="none"/>
+        </w:rPr>
+        <w:t xml:space="preserve">A presente proposta tem como objetivo a execução de serviços de escritório para a </w:t>
+      </w:r>
+      <w:r>
+        <w:rPr>
+          <w:rFonts w:ascii="Arial" w:eastAsia="Times New Roman" w:hAnsi="Arial" w:cs="Arial"/>
+          <w:b/>
+          <w:bCs/>
+          <w:kern w:val="0"/>
+          <w:lang w:eastAsia="pt-BR"/>
+          <w14:ligatures w14:val="none"/>
+        </w:rPr>
+        <w:t>Revisão e Adequação de Peças Técnicas</w:t>
+      </w:r>
+      <w:r>
+        <w:rPr>
+          <w:rFonts w:ascii="Arial" w:eastAsia="Times New Roman" w:hAnsi="Arial" w:cs="Arial"/>
+          <w:kern w:val="0"/>
+          <w:lang w:eastAsia="pt-BR"/>
+          <w14:ligatures w14:val="none"/>
+        </w:rPr>
+        <w:t xml:space="preserve"> anteriormente elaboradas.</w:t>
+      </w:r>
+    </w:p>
+    <w:p>
+      <w:pPr>
+        <w:numPr>
+          <w:ilvl w:val="0"/>
+          <w:numId w:val="3"/>
+        </w:numPr>
+        <w:spacing w:after="100" w:afterAutospacing="1" w:line="360" w:lineRule="auto"/>
+        <w:rPr>
+          <w:rFonts w:ascii="Arial" w:eastAsia="Times New Roman" w:hAnsi="Arial" w:cs="Arial"/>
+          <w:kern w:val="0"/>
+          <w:lang w:eastAsia="pt-BR"/>
+          <w14:ligatures w14:val="none"/>
+        </w:rPr>
+      </w:pPr>
+      <w:r>
+        <w:rPr>
+          <w:rFonts w:ascii="Arial" w:eastAsia="Times New Roman" w:hAnsi="Arial" w:cs="Arial"/>
+          <w:b/>
+          <w:bCs/>
+          <w:kern w:val="0"/>
+          <w:lang w:eastAsia="pt-BR"/>
+          <w14:ligatures w14:val="none"/>
+        </w:rPr>
+        <w:t>Finalidade:</w:t>
+      </w:r>
+      <w:r>
+        <w:rPr>
+          <w:rFonts w:ascii="Arial" w:eastAsia="Times New Roman" w:hAnsi="Arial" w:cs="Arial"/>
+          <w:kern w:val="0"/>
+          <w:lang w:eastAsia="pt-BR"/>
+          <w14:ligatures w14:val="none"/>
+        </w:rPr>
+        <w:t xml:space="preserve"> </w:t>
+      </w:r>
+      <w:r>
+        <w:rPr>
+          <w:rFonts w:ascii="Arial" w:eastAsia="Times New Roman" w:hAnsi="Arial" w:cs="Arial"/>
+          <w:kern w:val="0"/>
+          <w:sz w:val="20"/>
+          <w:szCs w:val="20"/>
+          <w:lang w:eastAsia="pt-BR"/>
+          <w14:ligatures w14:val="none"/>
+        </w:rPr>
+        <w:t>${finalidade}</w:t>
+      </w:r>
+      <w:r>
+        <w:rPr>
+          <w:rFonts w:ascii="Arial" w:eastAsia="Times New Roman" w:hAnsi="Arial" w:cs="Arial"/>
+          <w:kern w:val="0"/>
+          <w:lang w:eastAsia="pt-BR"/>
+          <w14:ligatures w14:val="none"/>
+        </w:rPr>
+        <w:t>.</w:t>
+      </w:r>
+    </w:p>
+    <w:p>
+      <w:pPr>
+        <w:numPr>
+          <w:ilvl w:val="0"/>
+          <w:numId w:val="3"/>
+        </w:numPr>
+        <w:spacing w:after="100" w:afterAutospacing="1" w:line="360" w:lineRule="auto"/>
+        <w:rPr>
+          <w:rFonts w:ascii="Arial" w:eastAsia="Times New Roman" w:hAnsi="Arial" w:cs="Arial"/>
+          <w:kern w:val="0"/>
+          <w:lang w:eastAsia="pt-BR"/>
+          <w14:ligatures w14:val="none"/>
+        </w:rPr>
+      </w:pPr>
+      <w:r>
+        <w:rPr>
+          <w:rFonts w:ascii="Arial" w:eastAsia="Times New Roman" w:hAnsi="Arial" w:cs="Arial"/>
+          <w:b/>
+          <w:bCs/>
+          <w:kern w:val="0"/>
+          <w:lang w:eastAsia="pt-BR"/>
+          <w14:ligatures w14:val="none"/>
+        </w:rPr>
+        <w:t>Base de Revisão:</w:t>
+      </w:r>
+      <w:r>
+        <w:rPr>
+          <w:rFonts w:ascii="Arial" w:eastAsia="Times New Roman" w:hAnsi="Arial" w:cs="Arial"/>
+          <w:kern w:val="0"/>
+          <w:lang w:eastAsia="pt-BR"/>
+          <w14:ligatures w14:val="none"/>
+        </w:rPr>
+        <w:t xml:space="preserve"> Todo o trabalho será rigorosamente </w:t>
+      </w:r>
+      <w:r>
+        <w:rPr>
+          <w:rFonts w:ascii="Arial" w:eastAsia="Times New Roman" w:hAnsi="Arial" w:cs="Arial"/>
+          <w:b/>
+          <w:bCs/>
+          <w:kern w:val="0"/>
+          <w:lang w:eastAsia="pt-BR"/>
+          <w14:ligatures w14:val="none"/>
+        </w:rPr>
+        <w:t xml:space="preserve">baseado e </w:t>
+      </w:r>
+      <w:proofErr w:type="spellStart"/>
+      <w:r>
+        <w:rPr>
+          <w:rFonts w:ascii="Arial" w:eastAsia="Times New Roman" w:hAnsi="Arial" w:cs="Arial"/>
+          <w:b/>
+          <w:bCs/>
+          <w:kern w:val="0"/>
+          <w:lang w:eastAsia="pt-BR"/>
+          <w14:ligatures w14:val="none"/>
+        </w:rPr>
+        <w:t>escotado</w:t>
+      </w:r>
+      <w:proofErr w:type="spellEnd"/>
+      <w:r>
+        <w:rPr>
+          <w:rFonts w:ascii="Arial" w:eastAsia="Times New Roman" w:hAnsi="Arial" w:cs="Arial"/>
+          <w:b/>
+          <w:bCs/>
+          <w:kern w:val="0"/>
+          <w:lang w:eastAsia="pt-BR"/>
+          <w14:ligatures w14:val="none"/>
+        </w:rPr>
+        <w:t xml:space="preserve"> no documento da petição da autoridade</w:t>
+      </w:r>
+      <w:r>
+        <w:rPr>
+          <w:rFonts w:ascii="Arial" w:eastAsia="Times New Roman" w:hAnsi="Arial" w:cs="Arial"/>
+          <w:kern w:val="0"/>
+          <w:lang w:eastAsia="pt-BR"/>
+          <w14:ligatures w14:val="none"/>
+        </w:rPr>
+        <w:t xml:space="preserve"> (Cartório, Prefeitura, Fórum ou Juiz). O serviço visa sanar as não conformidades </w:t>
+      </w:r>
+      <w:r>
+        <w:rPr>
+          <w:rFonts w:ascii="Arial" w:eastAsia="Times New Roman" w:hAnsi="Arial" w:cs="Arial"/>
+          <w:kern w:val="0"/>
+          <w:lang w:eastAsia="pt-BR"/>
+          <w14:ligatures w14:val="none"/>
+        </w:rPr>
+        <w:lastRenderedPageBreak/>
+        <w:t>ou alterações de dados apontadas pelo órgão, assegurando que a documentação técnica esteja em plena conformidade com as exigências legais para o deferimento do processo.</w:t>
+      </w:r>
+    </w:p>
+    <w:p>
+      <w:pPr>
+        <w:spacing w:after="100" w:afterAutospacing="1" w:line="240" w:lineRule="auto"/>
+        <w:outlineLvl w:val="2"/>
+        <w:rPr>
+          <w:rFonts w:ascii="Arial" w:eastAsia="Times New Roman" w:hAnsi="Arial" w:cs="Arial"/>
+          <w:b/>
+          <w:bCs/>
+          <w:kern w:val="0"/>
+          <w:sz w:val="27"/>
+          <w:szCs w:val="27"/>
+          <w:lang w:eastAsia="pt-BR"/>
+          <w14:ligatures w14:val="none"/>
+        </w:rPr>
+      </w:pPr>
+      <w:r>
+        <w:rPr>
+          <w:rFonts w:ascii="Arial" w:eastAsia="Times New Roman" w:hAnsi="Arial" w:cs="Arial"/>
+          <w:b/>
+          <w:bCs/>
+          <w:kern w:val="0"/>
+          <w:sz w:val="27"/>
+          <w:szCs w:val="27"/>
+          <w:lang w:eastAsia="pt-BR"/>
+          <w14:ligatures w14:val="none"/>
+        </w:rPr>
+        <w:t>5. Metodologia Técnica</w:t>
+      </w:r>
+    </w:p>
+    <w:p>
+      <w:pPr>
+        <w:spacing w:after="100" w:afterAutospacing="1" w:line="240" w:lineRule="auto"/>
+        <w:rPr>
+          <w:rFonts w:ascii="Arial" w:eastAsia="Times New Roman" w:hAnsi="Arial" w:cs="Arial"/>
+          <w:kern w:val="0"/>
+          <w:lang w:eastAsia="pt-BR"/>
+          <w14:ligatures w14:val="none"/>
+        </w:rPr>
+      </w:pPr>
+      <w:r>
+        <w:rPr>
+          <w:rFonts w:ascii="Arial" w:eastAsia="Times New Roman" w:hAnsi="Arial" w:cs="Arial"/>
+          <w:kern w:val="0"/>
+          <w:lang w:eastAsia="pt-BR"/>
+          <w14:ligatures w14:val="none"/>
+        </w:rPr>
+        <w:t>Para garantir que o produto final tenha validade técnica e jurídica, seguimos um rigoroso fluxo de trabalho:</w:t>
+      </w:r>
+    </w:p>
+    <w:p>
+      <w:pPr>
+        <w:numPr>
+          <w:ilvl w:val="0"/>
+          <w:numId w:val="4"/>
+        </w:numPr>
+        <w:spacing w:after="100" w:afterAutospacing="1" w:line="360" w:lineRule="auto"/>
+        <w:rPr>
+          <w:rFonts w:ascii="Arial" w:eastAsia="Times New Roman" w:hAnsi="Arial" w:cs="Arial"/>
+          <w:kern w:val="0"/>
+          <w:lang w:eastAsia="pt-BR"/>
+          <w14:ligatures w14:val="none"/>
+        </w:rPr>
+      </w:pPr>
+      <w:r>
+        <w:rPr>
+          <w:rFonts w:ascii="Arial" w:eastAsia="Times New Roman" w:hAnsi="Arial" w:cs="Arial"/>
+          <w:b/>
+          <w:bCs/>
+          <w:kern w:val="0"/>
+          <w:lang w:eastAsia="pt-BR"/>
+          <w14:ligatures w14:val="none"/>
+        </w:rPr>
+        <w:t>Análise de Notas de Devolução:</w:t>
+      </w:r>
+      <w:r>
+        <w:rPr>
+          <w:rFonts w:ascii="Arial" w:eastAsia="Times New Roman" w:hAnsi="Arial" w:cs="Arial"/>
+          <w:kern w:val="0"/>
+          <w:lang w:eastAsia="pt-BR"/>
+          <w14:ligatures w14:val="none"/>
+        </w:rPr>
+        <w:t xml:space="preserve"> Estudo técnico da petição ou despacho para identificar as retificações necessárias.</w:t>
+      </w:r>
+    </w:p>
+    <w:p>
+      <w:pPr>
+        <w:numPr>
+          <w:ilvl w:val="0"/>
+          <w:numId w:val="4"/>
+        </w:numPr>
+        <w:spacing w:after="100" w:afterAutospacing="1" w:line="360" w:lineRule="auto"/>
+        <w:rPr>
+          <w:rFonts w:ascii="Arial" w:eastAsia="Times New Roman" w:hAnsi="Arial" w:cs="Arial"/>
+          <w:kern w:val="0"/>
+          <w:lang w:eastAsia="pt-BR"/>
+          <w14:ligatures w14:val="none"/>
+        </w:rPr>
+      </w:pPr>
+      <w:r>
+        <w:rPr>
+          <w:rFonts w:ascii="Arial" w:eastAsia="Times New Roman" w:hAnsi="Arial" w:cs="Arial"/>
+          <w:b/>
+          <w:bCs/>
+          <w:kern w:val="0"/>
+          <w:lang w:eastAsia="pt-BR"/>
+          <w14:ligatures w14:val="none"/>
+        </w:rPr>
+        <w:t>Reprocessamento de Dados:</w:t>
+      </w:r>
+      <w:r>
+        <w:rPr>
+          <w:rFonts w:ascii="Arial" w:eastAsia="Times New Roman" w:hAnsi="Arial" w:cs="Arial"/>
+          <w:kern w:val="0"/>
+          <w:lang w:eastAsia="pt-BR"/>
+          <w14:ligatures w14:val="none"/>
+        </w:rPr>
+        <w:t xml:space="preserve"> Utilização de softwares de engenharia (CAD/Civil 3D) para ajuste de perímetros, áreas e coordenadas.</w:t>
+      </w:r>
+    </w:p>
+    <w:p>
+      <w:pPr>
+        <w:numPr>
+          <w:ilvl w:val="0"/>
+          <w:numId w:val="4"/>
+        </w:numPr>
+        <w:spacing w:after="100" w:afterAutospacing="1" w:line="360" w:lineRule="auto"/>
+        <w:rPr>
+          <w:rFonts w:ascii="Arial" w:eastAsia="Times New Roman" w:hAnsi="Arial" w:cs="Arial"/>
+          <w:kern w:val="0"/>
+          <w:lang w:eastAsia="pt-BR"/>
+          <w14:ligatures w14:val="none"/>
+        </w:rPr>
+      </w:pPr>
+      <w:r>
+        <w:rPr>
+          <w:rFonts w:ascii="Arial" w:eastAsia="Times New Roman" w:hAnsi="Arial" w:cs="Arial"/>
+          <w:b/>
+          <w:bCs/>
+          <w:kern w:val="0"/>
+          <w:lang w:eastAsia="pt-BR"/>
+          <w14:ligatures w14:val="none"/>
+        </w:rPr>
+        <w:t>Conformidade Normativa:</w:t>
+      </w:r>
+      <w:r>
+        <w:rPr>
+          <w:rFonts w:ascii="Arial" w:eastAsia="Times New Roman" w:hAnsi="Arial" w:cs="Arial"/>
+          <w:kern w:val="0"/>
+          <w:lang w:eastAsia="pt-BR"/>
+          <w14:ligatures w14:val="none"/>
+        </w:rPr>
+        <w:t xml:space="preserve"> Os trabalhos seguem a norma </w:t>
+      </w:r>
+      <w:r>
+        <w:rPr>
+          <w:rFonts w:ascii="Arial" w:eastAsia="Times New Roman" w:hAnsi="Arial" w:cs="Arial"/>
+          <w:b/>
+          <w:bCs/>
+          <w:kern w:val="0"/>
+          <w:lang w:eastAsia="pt-BR"/>
+          <w14:ligatures w14:val="none"/>
+        </w:rPr>
+        <w:t>ABNT NBR 13.133</w:t>
+      </w:r>
+      <w:r>
+        <w:rPr>
+          <w:rFonts w:ascii="Arial" w:eastAsia="Times New Roman" w:hAnsi="Arial" w:cs="Arial"/>
+          <w:kern w:val="0"/>
+          <w:lang w:eastAsia="pt-BR"/>
+          <w14:ligatures w14:val="none"/>
+        </w:rPr>
+        <w:t xml:space="preserve"> e o sistema de referência </w:t>
+      </w:r>
+      <w:r>
+        <w:rPr>
+          <w:rFonts w:ascii="Arial" w:eastAsia="Times New Roman" w:hAnsi="Arial" w:cs="Arial"/>
+          <w:b/>
+          <w:bCs/>
+          <w:kern w:val="0"/>
+          <w:lang w:eastAsia="pt-BR"/>
+          <w14:ligatures w14:val="none"/>
+        </w:rPr>
+        <w:t>SIRGAS2000 UTM</w:t>
+      </w:r>
+      <w:r>
+        <w:rPr>
+          <w:rFonts w:ascii="Arial" w:eastAsia="Times New Roman" w:hAnsi="Arial" w:cs="Arial"/>
+          <w:kern w:val="0"/>
+          <w:lang w:eastAsia="pt-BR"/>
+          <w14:ligatures w14:val="none"/>
+        </w:rPr>
+        <w:t>.</w:t>
+      </w:r>
+    </w:p>
+    <w:p>
+      <w:pPr>
+        <w:spacing w:after="0" w:afterAutospacing="1" w:line="240" w:lineRule="auto"/>
+        <w:ind w:left="720"/>
+        <w:rPr>
+          <w:rFonts w:ascii="Arial" w:eastAsia="Times New Roman" w:hAnsi="Arial" w:cs="Arial"/>
+          <w:kern w:val="0"/>
+          <w:lang w:eastAsia="pt-BR"/>
+          <w14:ligatures w14:val="none"/>
+        </w:rPr>
+      </w:pPr>
+    </w:p>
+    <w:p>
+      <w:pPr>
+        <w:spacing w:after="100" w:afterAutospacing="1" w:line="240" w:lineRule="auto"/>
+        <w:outlineLvl w:val="2"/>
+        <w:rPr>
+          <w:rFonts w:ascii="Arial" w:eastAsia="Times New Roman" w:hAnsi="Arial" w:cs="Arial"/>
+          <w:b/>
+          <w:bCs/>
+          <w:kern w:val="0"/>
+          <w:sz w:val="27"/>
+          <w:szCs w:val="27"/>
+          <w:lang w:eastAsia="pt-BR"/>
+          <w14:ligatures w14:val="none"/>
+        </w:rPr>
+      </w:pPr>
+      <w:r>
+        <w:rPr>
+          <w:rFonts w:ascii="Arial" w:eastAsia="Times New Roman" w:hAnsi="Arial" w:cs="Arial"/>
+          <w:b/>
+          <w:bCs/>
+          <w:kern w:val="0"/>
+          <w:sz w:val="27"/>
+          <w:szCs w:val="27"/>
+          <w:lang w:eastAsia="pt-BR"/>
+          <w14:ligatures w14:val="none"/>
+        </w:rPr>
+        <w:t>6. Produtos Entregáveis</w:t>
+      </w:r>
+    </w:p>
+    <w:p>
+      <w:pPr>
+        <w:spacing w:after="100" w:afterAutospacing="1" w:line="240" w:lineRule="auto"/>
+        <w:rPr>
+          <w:rFonts w:ascii="Arial" w:eastAsia="Times New Roman" w:hAnsi="Arial" w:cs="Arial"/>
+          <w:kern w:val="0"/>
+          <w:lang w:eastAsia="pt-BR"/>
+          <w14:ligatures w14:val="none"/>
+        </w:rPr>
+      </w:pPr>
+      <w:r>
+        <w:rPr>
+          <w:rFonts w:ascii="Arial" w:eastAsia="Times New Roman" w:hAnsi="Arial" w:cs="Arial"/>
+          <w:kern w:val="0"/>
+          <w:lang w:eastAsia="pt-BR"/>
+          <w14:ligatures w14:val="none"/>
+        </w:rPr>
+        <w:t>Ao final da prestação do serviço, entregaremos ao cliente:</w:t>
+      </w:r>
+    </w:p>
+    <w:p>
+      <w:pPr>
+        <w:numPr>
+          <w:ilvl w:val="0"/>
+          <w:numId w:val="5"/>
+        </w:numPr>
+        <w:spacing w:after="100" w:afterAutospacing="1" w:line="480" w:lineRule="auto"/>
+        <w:rPr>
+          <w:rFonts w:ascii="Arial" w:eastAsia="Times New Roman" w:hAnsi="Arial" w:cs="Arial"/>
+          <w:kern w:val="0"/>
+          <w:lang w:eastAsia="pt-BR"/>
+          <w14:ligatures w14:val="none"/>
+        </w:rPr>
+      </w:pPr>
+      <w:r>
+        <w:rPr>
+          <w:rFonts w:ascii="Arial" w:eastAsia="Times New Roman" w:hAnsi="Arial" w:cs="Arial"/>
+          <w:b/>
+          <w:bCs/>
+          <w:kern w:val="0"/>
+          <w:lang w:eastAsia="pt-BR"/>
+          <w14:ligatures w14:val="none"/>
+        </w:rPr>
+        <w:t>Planta Topográfica</w:t>
+      </w:r>
+      <w:r>
+        <w:rPr>
+          <w:rFonts w:ascii="Arial" w:eastAsia="Times New Roman" w:hAnsi="Arial" w:cs="Arial"/>
+          <w:kern w:val="0"/>
+          <w:lang w:eastAsia="pt-BR"/>
+          <w14:ligatures w14:val="none"/>
+        </w:rPr>
+        <w:t xml:space="preserve"> revisada, assinada por engenheiro habilitado.</w:t>
+      </w:r>
+    </w:p>
+    <w:p>
+      <w:pPr>
+        <w:numPr>
+          <w:ilvl w:val="0"/>
+          <w:numId w:val="5"/>
+        </w:numPr>
+        <w:spacing w:after="100" w:afterAutospacing="1" w:line="480" w:lineRule="auto"/>
+        <w:rPr>
+          <w:rFonts w:ascii="Arial" w:eastAsia="Times New Roman" w:hAnsi="Arial" w:cs="Arial"/>
+          <w:kern w:val="0"/>
+          <w:lang w:eastAsia="pt-BR"/>
+          <w14:ligatures w14:val="none"/>
+        </w:rPr>
+      </w:pPr>
+      <w:r>
+        <w:rPr>
+          <w:rFonts w:ascii="Arial" w:eastAsia="Times New Roman" w:hAnsi="Arial" w:cs="Arial"/>
+          <w:b/>
+          <w:bCs/>
+          <w:kern w:val="0"/>
+          <w:lang w:eastAsia="pt-BR"/>
+          <w14:ligatures w14:val="none"/>
+        </w:rPr>
+        <w:t>Memorial Descritivo</w:t>
+      </w:r>
+      <w:r>
+        <w:rPr>
+          <w:rFonts w:ascii="Arial" w:eastAsia="Times New Roman" w:hAnsi="Arial" w:cs="Arial"/>
+          <w:kern w:val="0"/>
+          <w:lang w:eastAsia="pt-BR"/>
+          <w14:ligatures w14:val="none"/>
+        </w:rPr>
+        <w:t xml:space="preserve"> técnico com as devidas correções de área e confrontantes.</w:t>
+      </w:r>
+    </w:p>
+    <w:p>
+      <w:pPr>
+        <w:numPr>
+          <w:ilvl w:val="0"/>
+          <w:numId w:val="5"/>
+        </w:numPr>
+        <w:spacing w:after="100" w:afterAutospacing="1" w:line="480" w:lineRule="auto"/>
+        <w:rPr>
+          <w:rFonts w:ascii="Arial" w:eastAsia="Times New Roman" w:hAnsi="Arial" w:cs="Arial"/>
+          <w:kern w:val="0"/>
+          <w:lang w:eastAsia="pt-BR"/>
+          <w14:ligatures w14:val="none"/>
+        </w:rPr>
+      </w:pPr>
+      <w:r>
+        <w:rPr>
+          <w:rFonts w:ascii="Arial" w:eastAsia="Times New Roman" w:hAnsi="Arial" w:cs="Arial"/>
+          <w:b/>
+          <w:bCs/>
+          <w:kern w:val="0"/>
+          <w:lang w:eastAsia="pt-BR"/>
+          <w14:ligatures w14:val="none"/>
+        </w:rPr>
+        <w:t>Arquivo digital</w:t>
+      </w:r>
+      <w:r>
+        <w:rPr>
+          <w:rFonts w:ascii="Arial" w:eastAsia="Times New Roman" w:hAnsi="Arial" w:cs="Arial"/>
+          <w:kern w:val="0"/>
+          <w:lang w:eastAsia="pt-BR"/>
+          <w14:ligatures w14:val="none"/>
+        </w:rPr>
+        <w:t xml:space="preserve"> em formatos PDF e DWG.</w:t>
+      </w:r>
+    </w:p>
+    <w:p>
+      <w:pPr>
+        <w:numPr>
+          <w:ilvl w:val="0"/>
+          <w:numId w:val="5"/>
+        </w:numPr>
+        <w:spacing w:after="100" w:afterAutospacing="1" w:line="480" w:lineRule="auto"/>
+        <w:rPr>
+          <w:rFonts w:ascii="Arial" w:eastAsia="Times New Roman" w:hAnsi="Arial" w:cs="Arial"/>
+          <w:kern w:val="0"/>
+          <w:lang w:eastAsia="pt-BR"/>
+          <w14:ligatures w14:val="none"/>
+        </w:rPr>
+      </w:pPr>
+      <w:r>
+        <w:rPr>
+          <w:rFonts w:ascii="Arial" w:eastAsia="Times New Roman" w:hAnsi="Arial" w:cs="Arial"/>
+          <w:b/>
+          <w:bCs/>
+          <w:kern w:val="0"/>
+          <w:lang w:eastAsia="pt-BR"/>
+          <w14:ligatures w14:val="none"/>
+        </w:rPr>
+        <w:t>ART (Anotação de Responsabilidade Técnica)</w:t>
+      </w:r>
+      <w:r>
+        <w:rPr>
+          <w:rFonts w:ascii="Arial" w:eastAsia="Times New Roman" w:hAnsi="Arial" w:cs="Arial"/>
+          <w:kern w:val="0"/>
+          <w:lang w:eastAsia="pt-BR"/>
+          <w14:ligatures w14:val="none"/>
+        </w:rPr>
+        <w:t xml:space="preserve"> registrada no CREA referente às alterações.</w:t>
+      </w:r>
+    </w:p>
+    <w:p>
+      <w:pPr>
+        <w:spacing w:after="0" w:afterAutospacing="1" w:line="240" w:lineRule="auto"/>
+        <w:ind w:left="720"/>
+        <w:rPr>
+          <w:rFonts w:ascii="Arial" w:eastAsia="Times New Roman" w:hAnsi="Arial" w:cs="Arial"/>
+          <w:kern w:val="0"/>
+          <w:lang w:eastAsia="pt-BR"/>
+          <w14:ligatures w14:val="none"/>
+        </w:rPr>
+      </w:pPr>
+    </w:p>
+    <w:p>
+      <w:pPr>
+        <w:spacing w:after="100" w:afterAutospacing="1" w:line="240" w:lineRule="auto"/>
+        <w:outlineLvl w:val="2"/>
+        <w:rPr>
+          <w:rFonts w:ascii="Arial" w:eastAsia="Times New Roman" w:hAnsi="Arial" w:cs="Arial"/>
+          <w:b/>
+          <w:bCs/>
+          <w:kern w:val="0"/>
+          <w:sz w:val="27"/>
+          <w:szCs w:val="27"/>
+          <w:lang w:eastAsia="pt-BR"/>
+          <w14:ligatures w14:val="none"/>
+        </w:rPr>
+      </w:pPr>
+      <w:r>
+        <w:rPr>
+          <w:rFonts w:ascii="Arial" w:eastAsia="Times New Roman" w:hAnsi="Arial" w:cs="Arial"/>
+          <w:b/>
+          <w:bCs/>
+          <w:kern w:val="0"/>
+          <w:sz w:val="27"/>
+          <w:szCs w:val="27"/>
+          <w:lang w:eastAsia="pt-BR"/>
+          <w14:ligatures w14:val="none"/>
+        </w:rPr>
+        <w:t>7. Investimento e Condições de Pagamento</w:t>
+      </w:r>
+    </w:p>
+    <w:p>
+      <w:pPr>
+        <w:spacing w:after="100" w:afterAutospacing="1" w:line="240" w:lineRule="auto"/>
+        <w:rPr>
+          <w:rFonts w:ascii="Arial" w:eastAsia="Times New Roman" w:hAnsi="Arial" w:cs="Arial"/>
+          <w:kern w:val="0"/>
+          <w:lang w:eastAsia="pt-BR"/>
+          <w14:ligatures w14:val="none"/>
+        </w:rPr>
+      </w:pPr>
+      <w:r>
+        <w:rPr>
+          <w:rFonts w:ascii="Arial" w:eastAsia="Times New Roman" w:hAnsi="Arial" w:cs="Arial"/>
+          <w:kern w:val="0"/>
+          <w:lang w:eastAsia="pt-BR"/>
+          <w14:ligatures w14:val="none"/>
+        </w:rPr>
+        <w:t>O valor total para a execução das adequações descritas é de:</w:t>
+      </w:r>
+    </w:p>
+    <w:p>
+      <w:pPr>
+        <w:pStyle w:val="PargrafodaLista"/>
+        <w:numPr>
+          <w:ilvl w:val="0"/>
+          <w:numId w:val="7"/>
+        </w:numPr>
+        <w:spacing w:after="100" w:afterAutospacing="1" w:line="360" w:lineRule="auto"/>
+        <w:rPr>
+          <w:rFonts w:ascii="Arial" w:eastAsia="Times New Roman" w:hAnsi="Arial" w:cs="Arial"/>
+          <w:kern w:val="0"/>
+          <w:lang w:eastAsia="pt-BR"/>
+          <w14:ligatures w14:val="none"/>
+        </w:rPr>
+      </w:pPr>
+      <w:r>
+        <w:rPr>
+          <w:rFonts w:ascii="Arial" w:eastAsia="Times New Roman" w:hAnsi="Arial" w:cs="Arial"/>
+          <w:b/>
+          <w:bCs/>
+          <w:kern w:val="0"/>
+          <w:lang w:eastAsia="pt-BR"/>
+          <w14:ligatures w14:val="none"/>
+        </w:rPr>
+        <w:t>Valor Total:</w:t>
+      </w:r>
+      <w:r>
+        <w:rPr>
+          <w:rFonts w:ascii="Arial" w:eastAsia="Times New Roman" w:hAnsi="Arial" w:cs="Arial"/>
+          <w:kern w:val="0"/>
+          <w:lang w:eastAsia="pt-BR"/>
+          <w14:ligatures w14:val="none"/>
+        </w:rPr>
+        <w:t xml:space="preserve"> </w:t>
+      </w:r>
+      <w:r>
+        <w:rPr>
+          <w:rFonts w:ascii="Arial" w:eastAsia="Times New Roman" w:hAnsi="Arial" w:cs="Arial"/>
+          <w:kern w:val="0"/>
+          <w:sz w:val="20"/>
+          <w:szCs w:val="20"/>
+          <w:lang w:eastAsia="pt-BR"/>
+          <w14:ligatures w14:val="none"/>
+        </w:rPr>
+        <w:t>R$ ${</w:t>
+      </w:r>
+      <w:proofErr w:type="spellStart"/>
+      <w:r>
+        <w:rPr>
+          <w:rFonts w:ascii="Arial" w:eastAsia="Times New Roman" w:hAnsi="Arial" w:cs="Arial"/>
+          <w:kern w:val="0"/>
+          <w:sz w:val="20"/>
+          <w:szCs w:val="20"/>
+          <w:lang w:eastAsia="pt-BR"/>
+          <w14:ligatures w14:val="none"/>
+        </w:rPr>
+        <w:t>ValorProposta</w:t>
+      </w:r>
+      <w:proofErr w:type="spellEnd"/>
+      <w:r>
+        <w:rPr>
+          <w:rFonts w:ascii="Arial" w:eastAsia="Times New Roman" w:hAnsi="Arial" w:cs="Arial"/>
+          <w:kern w:val="0"/>
+          <w:sz w:val="20"/>
+          <w:szCs w:val="20"/>
+          <w:lang w:eastAsia="pt-BR"/>
+          <w14:ligatures w14:val="none"/>
+        </w:rPr>
+        <w:t>}</w:t>
+      </w:r>
+      <w:r>
+        <w:rPr>
+          <w:rFonts w:ascii="Arial" w:eastAsia="Times New Roman" w:hAnsi="Arial" w:cs="Arial"/>
+          <w:kern w:val="0"/>
+          <w:lang w:eastAsia="pt-BR"/>
+          <w14:ligatures w14:val="none"/>
+        </w:rPr>
+        <w:t xml:space="preserve"> (</w:t>
+      </w:r>
+      <w:r>
+        <w:rPr>
+          <w:rFonts w:ascii="Arial" w:eastAsia="Times New Roman" w:hAnsi="Arial" w:cs="Arial"/>
+          <w:kern w:val="0"/>
+          <w:sz w:val="20"/>
+          <w:szCs w:val="20"/>
+          <w:lang w:eastAsia="pt-BR"/>
+          <w14:ligatures w14:val="none"/>
+        </w:rPr>
+        <w:t>${</w:t>
+      </w:r>
+      <w:proofErr w:type="spellStart"/>
+      <w:r>
+        <w:rPr>
+          <w:rFonts w:ascii="Arial" w:eastAsia="Times New Roman" w:hAnsi="Arial" w:cs="Arial"/>
+          <w:kern w:val="0"/>
+          <w:sz w:val="20"/>
+          <w:szCs w:val="20"/>
+          <w:lang w:eastAsia="pt-BR"/>
+          <w14:ligatures w14:val="none"/>
+        </w:rPr>
+        <w:t>ValorExtenso</w:t>
+      </w:r>
+      <w:proofErr w:type="spellEnd"/>
+      <w:r>
+        <w:rPr>
+          <w:rFonts w:ascii="Arial" w:eastAsia="Times New Roman" w:hAnsi="Arial" w:cs="Arial"/>
+          <w:kern w:val="0"/>
+          <w:sz w:val="20"/>
+          <w:szCs w:val="20"/>
+          <w:lang w:eastAsia="pt-BR"/>
+          <w14:ligatures w14:val="none"/>
+        </w:rPr>
+        <w:t>}</w:t>
+      </w:r>
+      <w:r>
+        <w:rPr>
+          <w:rFonts w:ascii="Arial" w:eastAsia="Times New Roman" w:hAnsi="Arial" w:cs="Arial"/>
+          <w:kern w:val="0"/>
+          <w:lang w:eastAsia="pt-BR"/>
+          <w14:ligatures w14:val="none"/>
+        </w:rPr>
+        <w:t>).</w:t>
+      </w:r>
+    </w:p>
+    <w:p>
+      <w:pPr>
+        <w:pStyle w:val="PargrafodaLista"/>
+        <w:numPr>
+          <w:ilvl w:val="0"/>
+          <w:numId w:val="7"/>
+        </w:numPr>
+        <w:spacing w:after="100" w:afterAutospacing="1" w:line="360" w:lineRule="auto"/>
+        <w:rPr>
+          <w:rFonts w:ascii="Arial" w:eastAsia="Times New Roman" w:hAnsi="Arial" w:cs="Arial"/>
+          <w:kern w:val="0"/>
+          <w:lang w:eastAsia="pt-BR"/>
+          <w14:ligatures w14:val="none"/>
+        </w:rPr>
+      </w:pPr>
+      <w:r>
+        <w:rPr>
+          <w:rFonts w:ascii="Arial" w:eastAsia="Times New Roman" w:hAnsi="Arial" w:cs="Arial"/>
+          <w:b/>
+          <w:bCs/>
+          <w:kern w:val="0"/>
+          <w:lang w:eastAsia="pt-BR"/>
+          <w14:ligatures w14:val="none"/>
+        </w:rPr>
+        <w:t>Mobilização (Aceite):</w:t>
+      </w:r>
+      <w:r>
+        <w:rPr>
+          <w:rFonts w:ascii="Arial" w:eastAsia="Times New Roman" w:hAnsi="Arial" w:cs="Arial"/>
+          <w:kern w:val="0"/>
+          <w:lang w:eastAsia="pt-BR"/>
+          <w14:ligatures w14:val="none"/>
+        </w:rPr>
+        <w:t xml:space="preserve"> </w:t>
+      </w:r>
+      <w:r>
+        <w:rPr>
+          <w:rFonts w:ascii="Arial" w:eastAsia="Times New Roman" w:hAnsi="Arial" w:cs="Arial"/>
+          <w:kern w:val="0"/>
+          <w:sz w:val="20"/>
+          <w:szCs w:val="20"/>
+          <w:lang w:eastAsia="pt-BR"/>
+          <w14:ligatures w14:val="none"/>
+        </w:rPr>
+        <w:t>${</w:t>
+      </w:r>
+      <w:proofErr w:type="spellStart"/>
+      <w:r>
+        <w:rPr>
+          <w:rFonts w:ascii="Arial" w:eastAsia="Times New Roman" w:hAnsi="Arial" w:cs="Arial"/>
+          <w:kern w:val="0"/>
+          <w:sz w:val="20"/>
+          <w:szCs w:val="20"/>
+          <w:lang w:eastAsia="pt-BR"/>
+          <w14:ligatures w14:val="none"/>
+        </w:rPr>
+        <w:t>mobilizacao_</w:t>
+      </w:r>
+      <w:proofErr w:type="gramStart"/>
+      <w:r>
+        <w:rPr>
+          <w:rFonts w:ascii="Arial" w:eastAsia="Times New Roman" w:hAnsi="Arial" w:cs="Arial"/>
+          <w:kern w:val="0"/>
+          <w:sz w:val="20"/>
+          <w:szCs w:val="20"/>
+          <w:lang w:eastAsia="pt-BR"/>
+          <w14:ligatures w14:val="none"/>
+        </w:rPr>
+        <w:t>percentual</w:t>
+      </w:r>
+      <w:proofErr w:type="spellEnd"/>
+      <w:r>
+        <w:rPr>
+          <w:rFonts w:ascii="Arial" w:eastAsia="Times New Roman" w:hAnsi="Arial" w:cs="Arial"/>
+          <w:kern w:val="0"/>
+          <w:sz w:val="20"/>
+          <w:szCs w:val="20"/>
+          <w:lang w:eastAsia="pt-BR"/>
+          <w14:ligatures w14:val="none"/>
+        </w:rPr>
+        <w:t>}%</w:t>
+      </w:r>
+      <w:proofErr w:type="gramEnd"/>
+      <w:r>
+        <w:rPr>
+          <w:rFonts w:ascii="Arial" w:eastAsia="Times New Roman" w:hAnsi="Arial" w:cs="Arial"/>
+          <w:kern w:val="0"/>
+          <w:lang w:eastAsia="pt-BR"/>
+          <w14:ligatures w14:val="none"/>
+        </w:rPr>
+        <w:t xml:space="preserve"> – </w:t>
+      </w:r>
+      <w:r>
+        <w:rPr>
+          <w:rFonts w:ascii="Arial" w:eastAsia="Times New Roman" w:hAnsi="Arial" w:cs="Arial"/>
+          <w:kern w:val="0"/>
+          <w:sz w:val="20"/>
+          <w:szCs w:val="20"/>
+          <w:lang w:eastAsia="pt-BR"/>
+          <w14:ligatures w14:val="none"/>
+        </w:rPr>
+        <w:t>R$ ${</w:t>
+      </w:r>
+      <w:proofErr w:type="spellStart"/>
+      <w:r>
+        <w:rPr>
+          <w:rFonts w:ascii="Arial" w:eastAsia="Times New Roman" w:hAnsi="Arial" w:cs="Arial"/>
+          <w:kern w:val="0"/>
+          <w:sz w:val="20"/>
+          <w:szCs w:val="20"/>
+          <w:lang w:eastAsia="pt-BR"/>
+          <w14:ligatures w14:val="none"/>
+        </w:rPr>
+        <w:t>mobilizacao_valor</w:t>
+      </w:r>
+      <w:proofErr w:type="spellEnd"/>
+      <w:r>
+        <w:rPr>
+          <w:rFonts w:ascii="Arial" w:eastAsia="Times New Roman" w:hAnsi="Arial" w:cs="Arial"/>
+          <w:kern w:val="0"/>
+          <w:sz w:val="20"/>
+          <w:szCs w:val="20"/>
+          <w:lang w:eastAsia="pt-BR"/>
+          <w14:ligatures w14:val="none"/>
+        </w:rPr>
+        <w:t>}</w:t>
+      </w:r>
+      <w:r>
+        <w:rPr>
+          <w:rFonts w:ascii="Arial" w:eastAsia="Times New Roman" w:hAnsi="Arial" w:cs="Arial"/>
+          <w:kern w:val="0"/>
+          <w:lang w:eastAsia="pt-BR"/>
+          <w14:ligatures w14:val="none"/>
+        </w:rPr>
+        <w:t>.</w:t>
+      </w:r>
+    </w:p>
+    <w:p>
+      <w:pPr>
+        <w:pStyle w:val="PargrafodaLista"/>
+        <w:numPr>
+          <w:ilvl w:val="0"/>
+          <w:numId w:val="7"/>
+        </w:numPr>
+        <w:spacing w:after="100" w:afterAutospacing="1" w:line="360" w:lineRule="auto"/>
+        <w:rPr>
+          <w:rFonts w:ascii="Arial" w:eastAsia="Times New Roman" w:hAnsi="Arial" w:cs="Arial"/>
+          <w:kern w:val="0"/>
+          <w:lang w:eastAsia="pt-BR"/>
+          <w14:ligatures w14:val="none"/>
+        </w:rPr>
+      </w:pPr>
+      <w:r>
+        <w:rPr>
+          <w:rFonts w:ascii="Arial" w:eastAsia="Times New Roman" w:hAnsi="Arial" w:cs="Arial"/>
+          <w:b/>
+          <w:bCs/>
+          <w:kern w:val="0"/>
+          <w:lang w:eastAsia="pt-BR"/>
+          <w14:ligatures w14:val="none"/>
+        </w:rPr>
+        <w:t>Entrega Final:</w:t>
+      </w:r>
+      <w:r>
+        <w:rPr>
+          <w:rFonts w:ascii="Arial" w:eastAsia="Times New Roman" w:hAnsi="Arial" w:cs="Arial"/>
+          <w:kern w:val="0"/>
+          <w:lang w:eastAsia="pt-BR"/>
+          <w14:ligatures w14:val="none"/>
+        </w:rPr>
+        <w:t xml:space="preserve"> </w:t>
+      </w:r>
+      <w:r>
+        <w:rPr>
+          <w:rFonts w:ascii="Arial" w:eastAsia="Times New Roman" w:hAnsi="Arial" w:cs="Arial"/>
+          <w:kern w:val="0"/>
+          <w:sz w:val="20"/>
+          <w:szCs w:val="20"/>
+          <w:lang w:eastAsia="pt-BR"/>
+          <w14:ligatures w14:val="none"/>
+        </w:rPr>
+        <w:t>${</w:t>
+      </w:r>
+      <w:proofErr w:type="spellStart"/>
+      <w:r>
+        <w:rPr>
+          <w:rFonts w:ascii="Arial" w:eastAsia="Times New Roman" w:hAnsi="Arial" w:cs="Arial"/>
+          <w:kern w:val="0"/>
+          <w:sz w:val="20"/>
+          <w:szCs w:val="20"/>
+          <w:lang w:eastAsia="pt-BR"/>
+          <w14:ligatures w14:val="none"/>
+        </w:rPr>
+        <w:t>restante_</w:t>
+      </w:r>
+      <w:proofErr w:type="gramStart"/>
+      <w:r>
+        <w:rPr>
+          <w:rFonts w:ascii="Arial" w:eastAsia="Times New Roman" w:hAnsi="Arial" w:cs="Arial"/>
+          <w:kern w:val="0"/>
+          <w:sz w:val="20"/>
+          <w:szCs w:val="20"/>
+          <w:lang w:eastAsia="pt-BR"/>
+          <w14:ligatures w14:val="none"/>
+        </w:rPr>
+        <w:t>percentual</w:t>
+      </w:r>
+      <w:proofErr w:type="spellEnd"/>
+      <w:r>
+        <w:rPr>
+          <w:rFonts w:ascii="Arial" w:eastAsia="Times New Roman" w:hAnsi="Arial" w:cs="Arial"/>
+          <w:kern w:val="0"/>
+          <w:sz w:val="20"/>
+          <w:szCs w:val="20"/>
+          <w:lang w:eastAsia="pt-BR"/>
+          <w14:ligatures w14:val="none"/>
+        </w:rPr>
+        <w:t>}%</w:t>
+      </w:r>
+      <w:proofErr w:type="gramEnd"/>
+      <w:r>
+        <w:rPr>
+          <w:rFonts w:ascii="Arial" w:eastAsia="Times New Roman" w:hAnsi="Arial" w:cs="Arial"/>
+          <w:kern w:val="0"/>
+          <w:lang w:eastAsia="pt-BR"/>
+          <w14:ligatures w14:val="none"/>
+        </w:rPr>
+        <w:t xml:space="preserve"> – </w:t>
+      </w:r>
+      <w:r>
+        <w:rPr>
+          <w:rFonts w:ascii="Arial" w:eastAsia="Times New Roman" w:hAnsi="Arial" w:cs="Arial"/>
+          <w:kern w:val="0"/>
+          <w:sz w:val="20"/>
+          <w:szCs w:val="20"/>
+          <w:lang w:eastAsia="pt-BR"/>
+          <w14:ligatures w14:val="none"/>
+        </w:rPr>
+        <w:t>R$ ${</w:t>
+      </w:r>
+      <w:proofErr w:type="spellStart"/>
+      <w:r>
+        <w:rPr>
+          <w:rFonts w:ascii="Arial" w:eastAsia="Times New Roman" w:hAnsi="Arial" w:cs="Arial"/>
+          <w:kern w:val="0"/>
+          <w:sz w:val="20"/>
+          <w:szCs w:val="20"/>
+          <w:lang w:eastAsia="pt-BR"/>
+          <w14:ligatures w14:val="none"/>
+        </w:rPr>
+        <w:t>restante_valor</w:t>
+      </w:r>
+      <w:proofErr w:type="spellEnd"/>
+      <w:r>
+        <w:rPr>
+          <w:rFonts w:ascii="Arial" w:eastAsia="Times New Roman" w:hAnsi="Arial" w:cs="Arial"/>
+          <w:kern w:val="0"/>
+          <w:sz w:val="20"/>
+          <w:szCs w:val="20"/>
+          <w:lang w:eastAsia="pt-BR"/>
+          <w14:ligatures w14:val="none"/>
+        </w:rPr>
+        <w:t>}</w:t>
+      </w:r>
+      <w:r>
+        <w:rPr>
+          <w:rFonts w:ascii="Arial" w:eastAsia="Times New Roman" w:hAnsi="Arial" w:cs="Arial"/>
+          <w:kern w:val="0"/>
+          <w:lang w:eastAsia="pt-BR"/>
+          <w14:ligatures w14:val="none"/>
+        </w:rPr>
+        <w:t>.</w:t>
+      </w:r>
+    </w:p>
+    <w:p>
+      <w:pPr>
+        <w:pStyle w:val="PargrafodaLista"/>
+        <w:numPr>
+          <w:ilvl w:val="0"/>
+          <w:numId w:val="7"/>
+        </w:numPr>
+        <w:spacing w:after="100" w:afterAutospacing="1" w:line="360" w:lineRule="auto"/>
+        <w:rPr>
+          <w:rFonts w:ascii="Arial" w:eastAsia="Times New Roman" w:hAnsi="Arial" w:cs="Arial"/>
+          <w:kern w:val="0"/>
+          <w:lang w:eastAsia="pt-BR"/>
+          <w14:ligatures w14:val="none"/>
+        </w:rPr>
+      </w:pPr>
+      <w:r>
+        <w:rPr>
+          <w:rFonts w:ascii="Arial" w:eastAsia="Times New Roman" w:hAnsi="Arial" w:cs="Arial"/>
+          <w:b/>
+          <w:bCs/>
+          <w:kern w:val="0"/>
+          <w:lang w:eastAsia="pt-BR"/>
+          <w14:ligatures w14:val="none"/>
+        </w:rPr>
+        <w:lastRenderedPageBreak/>
+        <w:t>Prazo de Execução:</w:t>
+      </w:r>
+      <w:r>
+        <w:rPr>
+          <w:rFonts w:ascii="Arial" w:eastAsia="Times New Roman" w:hAnsi="Arial" w:cs="Arial"/>
+          <w:kern w:val="0"/>
+          <w:lang w:eastAsia="pt-BR"/>
+          <w14:ligatures w14:val="none"/>
+        </w:rPr>
+        <w:t xml:space="preserve"> </w:t>
+      </w:r>
+      <w:r>
+        <w:rPr>
+          <w:rFonts w:ascii="Arial" w:eastAsia="Times New Roman" w:hAnsi="Arial" w:cs="Arial"/>
+          <w:kern w:val="0"/>
+          <w:sz w:val="20"/>
+          <w:szCs w:val="20"/>
+          <w:lang w:eastAsia="pt-BR"/>
+          <w14:ligatures w14:val="none"/>
+        </w:rPr>
+        <w:t>${</w:t>
+      </w:r>
+      <w:proofErr w:type="spellStart"/>
+      <w:r>
+        <w:rPr>
+          <w:rFonts w:ascii="Arial" w:eastAsia="Times New Roman" w:hAnsi="Arial" w:cs="Arial"/>
+          <w:kern w:val="0"/>
+          <w:sz w:val="20"/>
+          <w:szCs w:val="20"/>
+          <w:lang w:eastAsia="pt-BR"/>
+          <w14:ligatures w14:val="none"/>
+        </w:rPr>
+        <w:t>prazo_execucao</w:t>
+      </w:r>
+      <w:proofErr w:type="spellEnd"/>
+      <w:r>
+        <w:rPr>
+          <w:rFonts w:ascii="Arial" w:eastAsia="Times New Roman" w:hAnsi="Arial" w:cs="Arial"/>
+          <w:kern w:val="0"/>
+          <w:sz w:val="20"/>
+          <w:szCs w:val="20"/>
+          <w:lang w:eastAsia="pt-BR"/>
+          <w14:ligatures w14:val="none"/>
+        </w:rPr>
+        <w:t>}</w:t>
+      </w:r>
+      <w:r>
+        <w:rPr>
+          <w:rFonts w:ascii="Arial" w:eastAsia="Times New Roman" w:hAnsi="Arial" w:cs="Arial"/>
+          <w:kern w:val="0"/>
+          <w:lang w:eastAsia="pt-BR"/>
+          <w14:ligatures w14:val="none"/>
+        </w:rPr>
+        <w:t>.</w:t>
+      </w:r>
+    </w:p>
+    <w:p>
+      <w:pPr>
+        <w:spacing w:after="0" w:afterAutospacing="1" w:line="240" w:lineRule="auto"/>
+        <w:ind w:left="720"/>
+        <w:rPr>
+          <w:rFonts w:ascii="Arial" w:eastAsia="Times New Roman" w:hAnsi="Arial" w:cs="Arial"/>
+          <w:kern w:val="0"/>
+          <w:lang w:eastAsia="pt-BR"/>
+          <w14:ligatures w14:val="none"/>
+        </w:rPr>
+      </w:pPr>
+    </w:p>
+    <w:p>
+      <w:pPr>
+        <w:spacing w:after="100" w:afterAutospacing="1" w:line="240" w:lineRule="auto"/>
+        <w:outlineLvl w:val="2"/>
+        <w:rPr>
+          <w:rFonts w:ascii="Arial" w:eastAsia="Times New Roman" w:hAnsi="Arial" w:cs="Arial"/>
+          <w:b/>
+          <w:bCs/>
+          <w:kern w:val="0"/>
+          <w:sz w:val="27"/>
+          <w:szCs w:val="27"/>
+          <w:lang w:eastAsia="pt-BR"/>
+          <w14:ligatures w14:val="none"/>
+        </w:rPr>
+      </w:pPr>
+      <w:r>
+        <w:rPr>
+          <w:rFonts w:ascii="Arial" w:eastAsia="Times New Roman" w:hAnsi="Arial" w:cs="Arial"/>
+          <w:b/>
+          <w:bCs/>
+          <w:kern w:val="0"/>
+          <w:sz w:val="27"/>
+          <w:szCs w:val="27"/>
+          <w:lang w:eastAsia="pt-BR"/>
+          <w14:ligatures w14:val="none"/>
+        </w:rPr>
+        <w:t>8. Dados Bancários</w:t>
+      </w:r>
+    </w:p>
+    <w:tbl>
+      <w:tblPr>
+        <w:tblW w:w="0" w:type="auto"/>
+        <w:tblCellSpacing w:w="15" w:type="dxa"/>
+        <w:tblCellMar>
+          <w:top w:w="15" w:type="dxa"/>
+          <w:left w:w="15" w:type="dxa"/>
+          <w:bottom w:w="15" w:type="dxa"/>
+          <w:right w:w="15" w:type="dxa"/>
+        </w:tblCellMar>
+        <w:tblLook w:val="04A0" w:firstRow="1" w:lastRow="0" w:firstColumn="1" w:lastColumn="0" w:noHBand="0" w:noVBand="1"/>
+      </w:tblPr>
+      <w:tblGrid>
+        <w:gridCol w:w="2827"/>
+        <w:gridCol w:w="3504"/>
+      </w:tblGrid>
+      <w:tr>
+        <w:trPr>
+          <w:tblHeader/>
+          <w:tblCellSpacing w:w="15" w:type="dxa"/>
+        </w:trPr>
+        <w:tc>
+          <w:tcPr>
+            <w:tcW w:w="2782" w:type="dxa"/>
+            <w:tcBorders>
+              <w:top w:val="single" w:sz="6" w:space="0" w:color="auto"/>
+              <w:left w:val="single" w:sz="6" w:space="0" w:color="auto"/>
+              <w:bottom w:val="single" w:sz="6" w:space="0" w:color="auto"/>
+              <w:right w:val="single" w:sz="6" w:space="0" w:color="auto"/>
+            </w:tcBorders>
+            <w:vAlign w:val="center"/>
+            <w:hideMark/>
+          </w:tcPr>
+          <w:p>
+            <w:pPr>
+              <w:spacing w:after="0" w:line="240" w:lineRule="auto"/>
+              <w:jc w:val="center"/>
+              <w:rPr>
+                <w:rFonts w:ascii="Arial" w:eastAsia="Times New Roman" w:hAnsi="Arial" w:cs="Arial"/>
+                <w:kern w:val="0"/>
+                <w:lang w:eastAsia="pt-BR"/>
+                <w14:ligatures w14:val="none"/>
+              </w:rPr>
+            </w:pPr>
+            <w:r>
+              <w:rPr>
+                <w:rFonts w:ascii="Arial" w:eastAsia="Times New Roman" w:hAnsi="Arial" w:cs="Arial"/>
+                <w:b/>
+                <w:bCs/>
+                <w:kern w:val="0"/>
+                <w:lang w:eastAsia="pt-BR"/>
+                <w14:ligatures w14:val="none"/>
+              </w:rPr>
+              <w:t>INFORMAÇÕES PARA PAGAMENTO</w:t>
+            </w:r>
+          </w:p>
+        </w:tc>
+        <w:tc>
+          <w:tcPr>
+            <w:tcW w:w="3459" w:type="dxa"/>
+            <w:tcBorders>
+              <w:top w:val="single" w:sz="6" w:space="0" w:color="auto"/>
+              <w:left w:val="single" w:sz="6" w:space="0" w:color="auto"/>
+              <w:bottom w:val="single" w:sz="6" w:space="0" w:color="auto"/>
+              <w:right w:val="single" w:sz="6" w:space="0" w:color="auto"/>
+            </w:tcBorders>
+            <w:vAlign w:val="center"/>
+            <w:hideMark/>
+          </w:tcPr>
+          <w:p>
+            <w:pPr>
+              <w:spacing w:after="0" w:line="240" w:lineRule="auto"/>
+              <w:jc w:val="center"/>
+              <w:rPr>
+                <w:rFonts w:ascii="Arial" w:eastAsia="Times New Roman" w:hAnsi="Arial" w:cs="Arial"/>
+                <w:kern w:val="0"/>
+                <w:lang w:eastAsia="pt-BR"/>
+                <w14:ligatures w14:val="none"/>
+              </w:rPr>
+            </w:pPr>
+            <w:r>
+              <w:rPr>
+                <w:rFonts w:ascii="Arial" w:eastAsia="Times New Roman" w:hAnsi="Arial" w:cs="Arial"/>
+                <w:b/>
+                <w:bCs/>
+                <w:kern w:val="0"/>
+                <w:lang w:eastAsia="pt-BR"/>
+                <w14:ligatures w14:val="none"/>
+              </w:rPr>
+              <w:t>DADOS</w:t>
+            </w:r>
+          </w:p>
+        </w:tc>
+      </w:tr>
+      <w:tr>
+        <w:trPr>
+          <w:tblCellSpacing w:w="15" w:type="dxa"/>
+        </w:trPr>
+        <w:tc>
+          <w:tcPr>
+            <w:tcW w:w="2782" w:type="dxa"/>
+            <w:tcBorders>
+              <w:top w:val="single" w:sz="6" w:space="0" w:color="auto"/>
+              <w:left w:val="single" w:sz="6" w:space="0" w:color="auto"/>
+              <w:bottom w:val="single" w:sz="6" w:space="0" w:color="auto"/>
+              <w:right w:val="single" w:sz="6" w:space="0" w:color="auto"/>
+            </w:tcBorders>
+            <w:vAlign w:val="center"/>
+            <w:hideMark/>
+          </w:tcPr>
+          <w:p>
+            <w:pPr>
+              <w:spacing w:after="0" w:line="240" w:lineRule="auto"/>
+              <w:rPr>
+                <w:rFonts w:ascii="Arial" w:eastAsia="Times New Roman" w:hAnsi="Arial" w:cs="Arial"/>
+                <w:kern w:val="0"/>
+                <w:lang w:eastAsia="pt-BR"/>
+                <w14:ligatures w14:val="none"/>
+              </w:rPr>
+            </w:pPr>
+            <w:r>
+              <w:rPr>
+                <w:rFonts w:ascii="Arial" w:eastAsia="Times New Roman" w:hAnsi="Arial" w:cs="Arial"/>
+                <w:b/>
+                <w:bCs/>
+                <w:kern w:val="0"/>
+                <w:lang w:eastAsia="pt-BR"/>
+                <w14:ligatures w14:val="none"/>
+              </w:rPr>
+              <w:t>Banco</w:t>
+            </w:r>
+          </w:p>
+        </w:tc>
+        <w:tc>
+          <w:tcPr>
+            <w:tcW w:w="3459" w:type="dxa"/>
+            <w:tcBorders>
+              <w:top w:val="single" w:sz="6" w:space="0" w:color="auto"/>
+              <w:left w:val="single" w:sz="6" w:space="0" w:color="auto"/>
+              <w:bottom w:val="single" w:sz="6" w:space="0" w:color="auto"/>
+              <w:right w:val="single" w:sz="6" w:space="0" w:color="auto"/>
+            </w:tcBorders>
+            <w:vAlign w:val="center"/>
+            <w:hideMark/>
+          </w:tcPr>
+          <w:p>
+            <w:pPr>
+              <w:spacing w:after="0" w:line="240" w:lineRule="auto"/>
+              <w:rPr>
+                <w:rFonts w:ascii="Arial" w:eastAsia="Times New Roman" w:hAnsi="Arial" w:cs="Arial"/>
+                <w:kern w:val="0"/>
+                <w:lang w:eastAsia="pt-BR"/>
+                <w14:ligatures w14:val="none"/>
+              </w:rPr>
+            </w:pPr>
+            <w:r>
+              <w:rPr>
+                <w:rFonts w:ascii="Arial" w:eastAsia="Times New Roman" w:hAnsi="Arial" w:cs="Arial"/>
+                <w:kern w:val="0"/>
+                <w:sz w:val="20"/>
+                <w:szCs w:val="20"/>
+                <w:lang w:eastAsia="pt-BR"/>
+                <w14:ligatures w14:val="none"/>
+              </w:rPr>
+              <w:t>${Banco}</w:t>
+            </w:r>
+            <w:r>
+              <w:rPr>
+                <w:rFonts w:ascii="Arial" w:eastAsia="Times New Roman" w:hAnsi="Arial" w:cs="Arial"/>
+                <w:kern w:val="0"/>
+                <w:lang w:eastAsia="pt-BR"/>
+                <w14:ligatures w14:val="none"/>
+              </w:rPr>
+              <w:t xml:space="preserve"> </w:t>
+            </w:r>
+          </w:p>
+          <w:p>
+            <w:pPr>
+              <w:spacing w:after="0" w:line="240" w:lineRule="auto"/>
+              <w:rPr>
+                <w:rFonts w:ascii="Arial" w:eastAsia="Times New Roman" w:hAnsi="Arial" w:cs="Arial"/>
+                <w:kern w:val="0"/>
+                <w:lang w:eastAsia="pt-BR"/>
+                <w14:ligatures w14:val="none"/>
+              </w:rPr>
+            </w:pPr>
+          </w:p>
+        </w:tc>
+      </w:tr>
+      <w:tr>
+        <w:trPr>
+          <w:tblCellSpacing w:w="15" w:type="dxa"/>
+        </w:trPr>
+        <w:tc>
+          <w:tcPr>
+            <w:tcW w:w="2782" w:type="dxa"/>
+            <w:tcBorders>
+              <w:top w:val="single" w:sz="6" w:space="0" w:color="auto"/>
+              <w:left w:val="single" w:sz="6" w:space="0" w:color="auto"/>
+              <w:bottom w:val="single" w:sz="6" w:space="0" w:color="auto"/>
+              <w:right w:val="single" w:sz="6" w:space="0" w:color="auto"/>
+            </w:tcBorders>
+            <w:vAlign w:val="center"/>
+            <w:hideMark/>
+          </w:tcPr>
+          <w:p>
+            <w:pPr>
+              <w:spacing w:after="0" w:line="240" w:lineRule="auto"/>
+              <w:rPr>
+                <w:rFonts w:ascii="Arial" w:eastAsia="Times New Roman" w:hAnsi="Arial" w:cs="Arial"/>
+                <w:kern w:val="0"/>
+                <w:lang w:eastAsia="pt-BR"/>
+                <w14:ligatures w14:val="none"/>
+              </w:rPr>
+            </w:pPr>
+            <w:r>
+              <w:rPr>
+                <w:rFonts w:ascii="Arial" w:eastAsia="Times New Roman" w:hAnsi="Arial" w:cs="Arial"/>
+                <w:b/>
+                <w:bCs/>
+                <w:kern w:val="0"/>
+                <w:lang w:eastAsia="pt-BR"/>
+                <w14:ligatures w14:val="none"/>
+              </w:rPr>
+              <w:t>Agência / Conta</w:t>
+            </w:r>
+          </w:p>
+        </w:tc>
+        <w:tc>
+          <w:tcPr>
+            <w:tcW w:w="3459" w:type="dxa"/>
+            <w:tcBorders>
+              <w:top w:val="single" w:sz="6" w:space="0" w:color="auto"/>
+              <w:left w:val="single" w:sz="6" w:space="0" w:color="auto"/>
+              <w:bottom w:val="single" w:sz="6" w:space="0" w:color="auto"/>
+              <w:right w:val="single" w:sz="6" w:space="0" w:color="auto"/>
+            </w:tcBorders>
+            <w:vAlign w:val="center"/>
+            <w:hideMark/>
+          </w:tcPr>
+          <w:p>
+            <w:pPr>
+              <w:spacing w:after="0" w:line="240" w:lineRule="auto"/>
+              <w:rPr>
+                <w:rFonts w:ascii="Arial" w:eastAsia="Times New Roman" w:hAnsi="Arial" w:cs="Arial"/>
+                <w:kern w:val="0"/>
+                <w:lang w:eastAsia="pt-BR"/>
+                <w14:ligatures w14:val="none"/>
+              </w:rPr>
+            </w:pPr>
+            <w:r>
+              <w:rPr>
+                <w:rFonts w:ascii="Arial" w:eastAsia="Times New Roman" w:hAnsi="Arial" w:cs="Arial"/>
+                <w:kern w:val="0"/>
+                <w:sz w:val="20"/>
+                <w:szCs w:val="20"/>
+                <w:lang w:eastAsia="pt-BR"/>
+                <w14:ligatures w14:val="none"/>
+              </w:rPr>
+              <w:t>${Agencia}</w:t>
+            </w:r>
+            <w:r>
+              <w:rPr>
+                <w:rFonts w:ascii="Arial" w:eastAsia="Times New Roman" w:hAnsi="Arial" w:cs="Arial"/>
+                <w:kern w:val="0"/>
+                <w:lang w:eastAsia="pt-BR"/>
+                <w14:ligatures w14:val="none"/>
+              </w:rPr>
+              <w:t xml:space="preserve"> / </w:t>
+            </w:r>
+            <w:r>
+              <w:rPr>
+                <w:rFonts w:ascii="Arial" w:eastAsia="Times New Roman" w:hAnsi="Arial" w:cs="Arial"/>
+                <w:kern w:val="0"/>
+                <w:sz w:val="20"/>
+                <w:szCs w:val="20"/>
+                <w:lang w:eastAsia="pt-BR"/>
+                <w14:ligatures w14:val="none"/>
+              </w:rPr>
+              <w:t>${Conta}</w:t>
+            </w:r>
+            <w:r>
+              <w:rPr>
+                <w:rFonts w:ascii="Arial" w:eastAsia="Times New Roman" w:hAnsi="Arial" w:cs="Arial"/>
+                <w:kern w:val="0"/>
+                <w:lang w:eastAsia="pt-BR"/>
+                <w14:ligatures w14:val="none"/>
+              </w:rPr>
+              <w:t xml:space="preserve"> </w:t>
+            </w:r>
+          </w:p>
+          <w:p>
+            <w:pPr>
+              <w:spacing w:after="0" w:line="240" w:lineRule="auto"/>
+              <w:rPr>
+                <w:rFonts w:ascii="Arial" w:eastAsia="Times New Roman" w:hAnsi="Arial" w:cs="Arial"/>
+                <w:kern w:val="0"/>
+                <w:lang w:eastAsia="pt-BR"/>
+                <w14:ligatures w14:val="none"/>
+              </w:rPr>
+            </w:pPr>
+          </w:p>
+        </w:tc>
+      </w:tr>
+      <w:tr>
+        <w:trPr>
+          <w:tblCellSpacing w:w="15" w:type="dxa"/>
+        </w:trPr>
+        <w:tc>
+          <w:tcPr>
+            <w:tcW w:w="2782" w:type="dxa"/>
+            <w:tcBorders>
+              <w:top w:val="single" w:sz="6" w:space="0" w:color="auto"/>
+              <w:left w:val="single" w:sz="6" w:space="0" w:color="auto"/>
+              <w:bottom w:val="single" w:sz="6" w:space="0" w:color="auto"/>
+              <w:right w:val="single" w:sz="6" w:space="0" w:color="auto"/>
+            </w:tcBorders>
+            <w:vAlign w:val="center"/>
+            <w:hideMark/>
+          </w:tcPr>
+          <w:p>
+            <w:pPr>
+              <w:spacing w:after="0" w:line="240" w:lineRule="auto"/>
+              <w:rPr>
+                <w:rFonts w:ascii="Arial" w:eastAsia="Times New Roman" w:hAnsi="Arial" w:cs="Arial"/>
+                <w:kern w:val="0"/>
+                <w:lang w:eastAsia="pt-BR"/>
+                <w14:ligatures w14:val="none"/>
+              </w:rPr>
+            </w:pPr>
+            <w:r>
+              <w:rPr>
+                <w:rFonts w:ascii="Arial" w:eastAsia="Times New Roman" w:hAnsi="Arial" w:cs="Arial"/>
+                <w:b/>
+                <w:bCs/>
+                <w:kern w:val="0"/>
+                <w:lang w:eastAsia="pt-BR"/>
+                <w14:ligatures w14:val="none"/>
+              </w:rPr>
+              <w:t>Titular</w:t>
+            </w:r>
+          </w:p>
+        </w:tc>
+        <w:tc>
+          <w:tcPr>
+            <w:tcW w:w="3459" w:type="dxa"/>
+            <w:tcBorders>
+              <w:top w:val="single" w:sz="6" w:space="0" w:color="auto"/>
+              <w:left w:val="single" w:sz="6" w:space="0" w:color="auto"/>
+              <w:bottom w:val="single" w:sz="6" w:space="0" w:color="auto"/>
+              <w:right w:val="single" w:sz="6" w:space="0" w:color="auto"/>
+            </w:tcBorders>
+            <w:vAlign w:val="center"/>
+            <w:hideMark/>
+          </w:tcPr>
+          <w:p>
+            <w:pPr>
+              <w:spacing w:after="0" w:line="240" w:lineRule="auto"/>
+              <w:rPr>
+                <w:rFonts w:ascii="Arial" w:eastAsia="Times New Roman" w:hAnsi="Arial" w:cs="Arial"/>
+                <w:kern w:val="0"/>
+                <w:lang w:eastAsia="pt-BR"/>
+                <w14:ligatures w14:val="none"/>
+              </w:rPr>
+            </w:pPr>
+            <w:r>
+              <w:rPr>
+                <w:rFonts w:ascii="Arial" w:eastAsia="Times New Roman" w:hAnsi="Arial" w:cs="Arial"/>
+                <w:kern w:val="0"/>
+                <w:sz w:val="20"/>
+                <w:szCs w:val="20"/>
+                <w:lang w:eastAsia="pt-BR"/>
+                <w14:ligatures w14:val="none"/>
+              </w:rPr>
+              <w:t>${Empresa}</w:t>
+            </w:r>
+            <w:r>
+              <w:rPr>
+                <w:rFonts w:ascii="Arial" w:eastAsia="Times New Roman" w:hAnsi="Arial" w:cs="Arial"/>
+                <w:kern w:val="0"/>
+                <w:lang w:eastAsia="pt-BR"/>
+                <w14:ligatures w14:val="none"/>
+              </w:rPr>
+              <w:t xml:space="preserve"> </w:t>
+            </w:r>
+          </w:p>
+          <w:p>
+            <w:pPr>
+              <w:spacing w:after="0" w:line="240" w:lineRule="auto"/>
+              <w:rPr>
+                <w:rFonts w:ascii="Arial" w:eastAsia="Times New Roman" w:hAnsi="Arial" w:cs="Arial"/>
+                <w:kern w:val="0"/>
+                <w:lang w:eastAsia="pt-BR"/>
+                <w14:ligatures w14:val="none"/>
+              </w:rPr>
+            </w:pPr>
+          </w:p>
+        </w:tc>
+      </w:tr>
+      <w:tr>
+        <w:trPr>
+          <w:tblCellSpacing w:w="15" w:type="dxa"/>
+        </w:trPr>
+        <w:tc>
+          <w:tcPr>
+            <w:tcW w:w="2782" w:type="dxa"/>
+            <w:tcBorders>
+              <w:top w:val="single" w:sz="6" w:space="0" w:color="auto"/>
+              <w:left w:val="single" w:sz="6" w:space="0" w:color="auto"/>
+              <w:bottom w:val="single" w:sz="6" w:space="0" w:color="auto"/>
+              <w:right w:val="single" w:sz="6" w:space="0" w:color="auto"/>
+            </w:tcBorders>
+            <w:vAlign w:val="center"/>
+            <w:hideMark/>
+          </w:tcPr>
+          <w:p>
+            <w:pPr>
+              <w:spacing w:after="0" w:line="240" w:lineRule="auto"/>
+              <w:rPr>
+                <w:rFonts w:ascii="Arial" w:eastAsia="Times New Roman" w:hAnsi="Arial" w:cs="Arial"/>
+                <w:kern w:val="0"/>
+                <w:lang w:eastAsia="pt-BR"/>
+                <w14:ligatures w14:val="none"/>
+              </w:rPr>
+            </w:pPr>
+            <w:r>
+              <w:rPr>
+                <w:rFonts w:ascii="Arial" w:eastAsia="Times New Roman" w:hAnsi="Arial" w:cs="Arial"/>
+                <w:b/>
+                <w:bCs/>
+                <w:kern w:val="0"/>
+                <w:lang w:eastAsia="pt-BR"/>
+                <w14:ligatures w14:val="none"/>
+              </w:rPr>
+              <w:t>CNPJ</w:t>
+            </w:r>
+          </w:p>
+        </w:tc>
+        <w:tc>
+          <w:tcPr>
+            <w:tcW w:w="3459" w:type="dxa"/>
+            <w:tcBorders>
+              <w:top w:val="single" w:sz="6" w:space="0" w:color="auto"/>
+              <w:left w:val="single" w:sz="6" w:space="0" w:color="auto"/>
+              <w:bottom w:val="single" w:sz="6" w:space="0" w:color="auto"/>
+              <w:right w:val="single" w:sz="6" w:space="0" w:color="auto"/>
+            </w:tcBorders>
+            <w:vAlign w:val="center"/>
+            <w:hideMark/>
+          </w:tcPr>
+          <w:p>
+            <w:pPr>
+              <w:spacing w:after="0" w:line="240" w:lineRule="auto"/>
+              <w:rPr>
+                <w:rFonts w:ascii="Arial" w:eastAsia="Times New Roman" w:hAnsi="Arial" w:cs="Arial"/>
+                <w:kern w:val="0"/>
+                <w:lang w:eastAsia="pt-BR"/>
+                <w14:ligatures w14:val="none"/>
+              </w:rPr>
+            </w:pPr>
+            <w:r>
+              <w:rPr>
+                <w:rFonts w:ascii="Arial" w:eastAsia="Times New Roman" w:hAnsi="Arial" w:cs="Arial"/>
+                <w:kern w:val="0"/>
+                <w:sz w:val="20"/>
+                <w:szCs w:val="20"/>
+                <w:lang w:eastAsia="pt-BR"/>
+                <w14:ligatures w14:val="none"/>
+              </w:rPr>
+              <w:t>${CNPJ}</w:t>
+            </w:r>
+            <w:r>
+              <w:rPr>
+                <w:rFonts w:ascii="Arial" w:eastAsia="Times New Roman" w:hAnsi="Arial" w:cs="Arial"/>
+                <w:kern w:val="0"/>
+                <w:lang w:eastAsia="pt-BR"/>
+                <w14:ligatures w14:val="none"/>
+              </w:rPr>
+              <w:t xml:space="preserve"> </w:t>
+            </w:r>
+          </w:p>
+          <w:p>
+            <w:pPr>
+              <w:spacing w:after="0" w:line="240" w:lineRule="auto"/>
+              <w:rPr>
+                <w:rFonts w:ascii="Arial" w:eastAsia="Times New Roman" w:hAnsi="Arial" w:cs="Arial"/>
+                <w:kern w:val="0"/>
+                <w:lang w:eastAsia="pt-BR"/>
+                <w14:ligatures w14:val="none"/>
+              </w:rPr>
+            </w:pPr>
+          </w:p>
+        </w:tc>
+      </w:tr>
+      <w:tr>
+        <w:trPr>
+          <w:tblCellSpacing w:w="15" w:type="dxa"/>
+        </w:trPr>
+        <w:tc>
+          <w:tcPr>
+            <w:tcW w:w="2782" w:type="dxa"/>
+            <w:tcBorders>
+              <w:top w:val="single" w:sz="6" w:space="0" w:color="auto"/>
+              <w:left w:val="single" w:sz="6" w:space="0" w:color="auto"/>
+              <w:bottom w:val="single" w:sz="6" w:space="0" w:color="auto"/>
+              <w:right w:val="single" w:sz="6" w:space="0" w:color="auto"/>
+            </w:tcBorders>
+            <w:vAlign w:val="center"/>
+            <w:hideMark/>
+          </w:tcPr>
+          <w:p>
+            <w:pPr>
+              <w:spacing w:after="0" w:line="240" w:lineRule="auto"/>
+              <w:rPr>
+                <w:rFonts w:ascii="Arial" w:eastAsia="Times New Roman" w:hAnsi="Arial" w:cs="Arial"/>
+                <w:kern w:val="0"/>
+                <w:lang w:eastAsia="pt-BR"/>
+                <w14:ligatures w14:val="none"/>
+              </w:rPr>
+            </w:pPr>
+            <w:r>
+              <w:rPr>
+                <w:rFonts w:ascii="Arial" w:eastAsia="Times New Roman" w:hAnsi="Arial" w:cs="Arial"/>
+                <w:b/>
+                <w:bCs/>
+                <w:kern w:val="0"/>
+                <w:lang w:eastAsia="pt-BR"/>
+                <w14:ligatures w14:val="none"/>
+              </w:rPr>
+              <w:t>Chave PIX</w:t>
+            </w:r>
+          </w:p>
+        </w:tc>
+        <w:tc>
+          <w:tcPr>
+            <w:tcW w:w="3459" w:type="dxa"/>
+            <w:tcBorders>
+              <w:top w:val="single" w:sz="6" w:space="0" w:color="auto"/>
+              <w:left w:val="single" w:sz="6" w:space="0" w:color="auto"/>
+              <w:bottom w:val="single" w:sz="6" w:space="0" w:color="auto"/>
+              <w:right w:val="single" w:sz="6" w:space="0" w:color="auto"/>
+            </w:tcBorders>
+            <w:vAlign w:val="center"/>
+            <w:hideMark/>
+          </w:tcPr>
+          <w:p>
+            <w:pPr>
+              <w:spacing w:after="0" w:line="240" w:lineRule="auto"/>
+              <w:rPr>
+                <w:rFonts w:ascii="Arial" w:eastAsia="Times New Roman" w:hAnsi="Arial" w:cs="Arial"/>
+                <w:kern w:val="0"/>
+                <w:lang w:eastAsia="pt-BR"/>
+                <w14:ligatures w14:val="none"/>
+              </w:rPr>
+            </w:pPr>
+            <w:r>
+              <w:rPr>
+                <w:rFonts w:ascii="Arial" w:eastAsia="Times New Roman" w:hAnsi="Arial" w:cs="Arial"/>
+                <w:kern w:val="0"/>
+                <w:sz w:val="20"/>
+                <w:szCs w:val="20"/>
+                <w:lang w:eastAsia="pt-BR"/>
+                <w14:ligatures w14:val="none"/>
+              </w:rPr>
+              <w:t>${PIX}</w:t>
+            </w:r>
+            <w:r>
+              <w:rPr>
+                <w:rFonts w:ascii="Arial" w:eastAsia="Times New Roman" w:hAnsi="Arial" w:cs="Arial"/>
+                <w:kern w:val="0"/>
+                <w:lang w:eastAsia="pt-BR"/>
+                <w14:ligatures w14:val="none"/>
+              </w:rPr>
+              <w:t xml:space="preserve"> </w:t>
+            </w:r>
+          </w:p>
+          <w:p>
+            <w:pPr>
+              <w:spacing w:after="0" w:line="240" w:lineRule="auto"/>
+              <w:rPr>
+                <w:rFonts w:ascii="Arial" w:eastAsia="Times New Roman" w:hAnsi="Arial" w:cs="Arial"/>
+                <w:kern w:val="0"/>
+                <w:lang w:eastAsia="pt-BR"/>
+                <w14:ligatures w14:val="none"/>
+              </w:rPr>
+            </w:pPr>
+          </w:p>
+        </w:tc>
+      </w:tr>
+    </w:tbl>
+    <w:p>
+      <w:pPr>
+        <w:spacing w:after="100" w:afterAutospacing="1" w:line="240" w:lineRule="auto"/>
+        <w:outlineLvl w:val="2"/>
+        <w:rPr>
+          <w:rFonts w:ascii="Arial" w:eastAsia="Times New Roman" w:hAnsi="Arial" w:cs="Arial"/>
+          <w:b/>
+          <w:bCs/>
+          <w:kern w:val="0"/>
+          <w:sz w:val="27"/>
+          <w:szCs w:val="27"/>
+          <w:lang w:eastAsia="pt-BR"/>
+          <w14:ligatures w14:val="none"/>
+        </w:rPr>
+      </w:pPr>
+    </w:p>
+    <w:p>
+      <w:pPr>
+        <w:spacing w:after="100" w:afterAutospacing="1" w:line="240" w:lineRule="auto"/>
+        <w:outlineLvl w:val="2"/>
+        <w:rPr>
+          <w:rFonts w:ascii="Arial" w:eastAsia="Times New Roman" w:hAnsi="Arial" w:cs="Arial"/>
+          <w:b/>
+          <w:bCs/>
+          <w:kern w:val="0"/>
+          <w:sz w:val="27"/>
+          <w:szCs w:val="27"/>
+          <w:lang w:eastAsia="pt-BR"/>
+          <w14:ligatures w14:val="none"/>
+        </w:rPr>
+      </w:pPr>
+      <w:r>
+        <w:rPr>
+          <w:rFonts w:ascii="Arial" w:eastAsia="Times New Roman" w:hAnsi="Arial" w:cs="Arial"/>
+          <w:b/>
+          <w:bCs/>
+          <w:kern w:val="0"/>
+          <w:sz w:val="27"/>
+          <w:szCs w:val="27"/>
+          <w:lang w:eastAsia="pt-BR"/>
+          <w14:ligatures w14:val="none"/>
+        </w:rPr>
+        <w:t>9. Considerações Finais</w:t>
+      </w:r>
+    </w:p>
+    <w:p>
+      <w:pPr>
+        <w:spacing w:after="100" w:afterAutospacing="1" w:line="240" w:lineRule="auto"/>
+        <w:rPr>
+          <w:rFonts w:ascii="Arial" w:eastAsia="Times New Roman" w:hAnsi="Arial" w:cs="Arial"/>
+          <w:kern w:val="0"/>
+          <w:lang w:eastAsia="pt-BR"/>
+          <w14:ligatures w14:val="none"/>
+        </w:rPr>
+      </w:pPr>
+      <w:r>
+        <w:rPr>
+          <w:rFonts w:ascii="Arial" w:eastAsia="Times New Roman" w:hAnsi="Arial" w:cs="Arial"/>
+          <w:kern w:val="0"/>
+          <w:lang w:eastAsia="pt-BR"/>
+          <w14:ligatures w14:val="none"/>
+        </w:rPr>
+        <w:t xml:space="preserve">Agradecemos a oportunidade de apresentar nossa proposta técnica. Reforçamos que a </w:t>
+      </w:r>
+      <w:r>
+        <w:rPr>
+          <w:rFonts w:ascii="Arial" w:eastAsia="Times New Roman" w:hAnsi="Arial" w:cs="Arial"/>
+          <w:kern w:val="0"/>
+          <w:sz w:val="20"/>
+          <w:szCs w:val="20"/>
+          <w:lang w:eastAsia="pt-BR"/>
+          <w14:ligatures w14:val="none"/>
+        </w:rPr>
+        <w:t>${Empresa}</w:t>
+      </w:r>
+      <w:r>
+        <w:rPr>
+          <w:rFonts w:ascii="Arial" w:eastAsia="Times New Roman" w:hAnsi="Arial" w:cs="Arial"/>
+          <w:kern w:val="0"/>
+          <w:lang w:eastAsia="pt-BR"/>
+          <w14:ligatures w14:val="none"/>
+        </w:rPr>
+        <w:t xml:space="preserve"> atua exclusivamente na esfera da engenharia. Estamos à disposição para entregar um trabalho de excelência, deixando a documentação pronta para que o(a) senhor(a) possa dar andamento aos trâmites legais.</w:t>
+      </w:r>
+    </w:p>
+    <w:p>
+      <w:pPr>
+        <w:spacing w:after="0" w:line="240" w:lineRule="auto"/>
+        <w:rPr>
+          <w:rFonts w:ascii="Arial" w:eastAsia="Times New Roman" w:hAnsi="Arial" w:cs="Arial"/>
+          <w:kern w:val="0"/>
+          <w:lang w:eastAsia="pt-BR"/>
+          <w14:ligatures w14:val="none"/>
+        </w:rPr>
+      </w:pPr>
+    </w:p>
+    <w:p>
+      <w:pPr>
+        <w:spacing w:after="100" w:afterAutospacing="1" w:line="240" w:lineRule="auto"/>
+        <w:rPr>
+          <w:rFonts w:ascii="Arial" w:eastAsia="Times New Roman" w:hAnsi="Arial" w:cs="Arial"/>
+          <w:kern w:val="0"/>
+          <w:lang w:eastAsia="pt-BR"/>
+          <w14:ligatures w14:val="none"/>
+        </w:rPr>
+      </w:pPr>
+      <w:r>
+        <w:rPr>
+          <w:rFonts w:ascii="Arial" w:eastAsia="Times New Roman" w:hAnsi="Arial" w:cs="Arial"/>
+          <w:b/>
+          <w:bCs/>
+          <w:kern w:val="0"/>
+          <w:lang w:eastAsia="pt-BR"/>
+          <w14:ligatures w14:val="none"/>
+        </w:rPr>
+        <w:t>Atenciosamente,</w:t>
+      </w:r>
+    </w:p>
+    <w:p>
+      <w:pPr>
+        <w:spacing w:after="0" w:line="240" w:lineRule="auto"/>
+        <w:rPr>
+          <w:rFonts w:ascii="Arial" w:eastAsia="Times New Roman" w:hAnsi="Arial" w:cs="Arial"/>
+          <w:kern w:val="0"/>
+          <w:lang w:eastAsia="pt-BR"/>
+          <w14:ligatures w14:val="none"/>
+        </w:rPr>
+      </w:pPr>
+      <w:r>
+        <w:rPr>
+          <w:rFonts w:ascii="Times New Roman" w:eastAsia="Times New Roman" w:hAnsi="Times New Roman" w:cs="Times New Roman"/>
+          <w:kern w:val="0"/>
+          <w:lang w:eastAsia="pt-BR"/>
+          <w14:ligatures w14:val="none"/>
+        </w:rPr>
+        <w:pict w14:anchorId="75D195D2">
+          <v:rect id="_x0000_i1025" style="width:0;height:1.5pt" o:hralign="center" o:hrstd="t" o:hr="t" fillcolor="#a0a0a0" stroked="f"/>
+        </w:pict>
+      </w:r>
+    </w:p>
+    <w:p>
+      <w:pPr>
+        <w:spacing w:after="100" w:afterAutospacing="1" w:line="240" w:lineRule="auto"/>
+        <w:rPr>
+          <w:rFonts w:ascii="Arial" w:eastAsia="Times New Roman" w:hAnsi="Arial" w:cs="Arial"/>
+          <w:kern w:val="0"/>
+          <w:lang w:eastAsia="pt-BR"/>
+          <w14:ligatures w14:val="none"/>
+        </w:rPr>
+      </w:pPr>
+      <w:r>
+        <w:rPr>
+          <w:rFonts w:ascii="Arial" w:eastAsia="Times New Roman" w:hAnsi="Arial" w:cs="Arial"/>
+          <w:b/>
+          <w:bCs/>
+          <w:kern w:val="0"/>
+          <w:sz w:val="20"/>
+          <w:szCs w:val="20"/>
+          <w:lang w:eastAsia="pt-BR"/>
+          <w14:ligatures w14:val="none"/>
+        </w:rPr>
+        <w:t>${Empresa}</w:t>
+      </w:r>
+      <w:r>
+        <w:rPr>
+          <w:rFonts w:ascii="Arial" w:eastAsia="Times New Roman" w:hAnsi="Arial" w:cs="Arial"/>
+          <w:kern w:val="0"/>
+          <w:lang w:eastAsia="pt-BR"/>
+          <w14:ligatures w14:val="none"/>
+        </w:rPr>
+        <w:t xml:space="preserve"> </w:t>
+      </w:r>
+      <w:r>
+        <w:rPr>
+          <w:rFonts w:ascii="Arial" w:eastAsia="Times New Roman" w:hAnsi="Arial" w:cs="Arial"/>
+          <w:b/>
+          <w:bCs/>
+          <w:kern w:val="0"/>
+          <w:lang w:eastAsia="pt-BR"/>
+          <w14:ligatures w14:val="none"/>
+        </w:rPr>
+        <w:t>Contato:</w:t>
+      </w:r>
+      <w:r>
+        <w:rPr>
+          <w:rFonts w:ascii="Arial" w:eastAsia="Times New Roman" w:hAnsi="Arial" w:cs="Arial"/>
+          <w:kern w:val="0"/>
+          <w:lang w:eastAsia="pt-BR"/>
+          <w14:ligatures w14:val="none"/>
+        </w:rPr>
+        <w:t xml:space="preserve"> </w:t>
+      </w:r>
+      <w:r>
+        <w:rPr>
+          <w:rFonts w:ascii="Arial" w:eastAsia="Times New Roman" w:hAnsi="Arial" w:cs="Arial"/>
+          <w:kern w:val="0"/>
+          <w:sz w:val="20"/>
+          <w:szCs w:val="20"/>
+          <w:lang w:eastAsia="pt-BR"/>
+          <w14:ligatures w14:val="none"/>
+        </w:rPr>
+        <w:t>${</w:t>
+      </w:r>
+      <w:proofErr w:type="spellStart"/>
+      <w:r>
+        <w:rPr>
+          <w:rFonts w:ascii="Arial" w:eastAsia="Times New Roman" w:hAnsi="Arial" w:cs="Arial"/>
+          <w:kern w:val="0"/>
+          <w:sz w:val="20"/>
+          <w:szCs w:val="20"/>
+          <w:lang w:eastAsia="pt-BR"/>
+          <w14:ligatures w14:val="none"/>
+        </w:rPr>
+        <w:t>whatsapp</w:t>
+      </w:r>
+      <w:proofErr w:type="spellEnd"/>
+      <w:r>
+        <w:rPr>
+          <w:rFonts w:ascii="Arial" w:eastAsia="Times New Roman" w:hAnsi="Arial" w:cs="Arial"/>
+          <w:kern w:val="0"/>
+          <w:sz w:val="20"/>
+          <w:szCs w:val="20"/>
+          <w:lang w:eastAsia="pt-BR"/>
+          <w14:ligatures w14:val="none"/>
+        </w:rPr>
+        <w:t>}</w:t>
+      </w:r>
+      <w:r>
+        <w:rPr>
+          <w:rFonts w:ascii="Arial" w:eastAsia="Times New Roman" w:hAnsi="Arial" w:cs="Arial"/>
+          <w:kern w:val="0"/>
+          <w:lang w:eastAsia="pt-BR"/>
+          <w14:ligatures w14:val="none"/>
+        </w:rPr>
+        <w:t xml:space="preserve"> </w:t>
+      </w:r>
+    </w:p>
+    <w:p>
+      <w:pPr>
+        <w:spacing w:after="0" w:line="240" w:lineRule="auto"/>
+        <w:rPr>
+          <w:rFonts w:ascii="Arial" w:eastAsia="Times New Roman" w:hAnsi="Arial" w:cs="Arial"/>
+          <w:kern w:val="0"/>
+          <w:lang w:eastAsia="pt-BR"/>
+          <w14:ligatures w14:val="none"/>
+        </w:rPr>
+      </w:pPr>
+    </w:p>
+    <w:p>
+      <w:pPr>
+        <w:spacing w:after="0" w:line="240" w:lineRule="auto"/>
+        <w:rPr>
+          <w:rFonts w:ascii="Arial" w:eastAsia="Times New Roman" w:hAnsi="Arial" w:cs="Arial"/>
+          <w:kern w:val="0"/>
+          <w:lang w:eastAsia="pt-BR"/>
+          <w14:ligatures w14:val="none"/>
+        </w:rPr>
+      </w:pPr>
+      <w:r>
+        <w:rPr>
+          <w:rFonts w:ascii="Times New Roman" w:eastAsia="Times New Roman" w:hAnsi="Times New Roman" w:cs="Times New Roman"/>
+          <w:kern w:val="0"/>
+          <w:lang w:eastAsia="pt-BR"/>
+          <w14:ligatures w14:val="none"/>
+        </w:rPr>
+        <w:pict w14:anchorId="046D9E37">
+          <v:rect id="_x0000_i1026" style="width:0;height:1.5pt" o:hralign="center" o:hrstd="t" o:hr="t" fillcolor="#a0a0a0" stroked="f"/>
+        </w:pict>
+      </w:r>
+    </w:p>
+    <w:p>
+      <w:pPr>
+        <w:spacing w:after="100" w:afterAutospacing="1" w:line="240" w:lineRule="auto"/>
+        <w:rPr>
+          <w:rFonts w:ascii="Arial" w:eastAsia="Times New Roman" w:hAnsi="Arial" w:cs="Arial"/>
+          <w:kern w:val="0"/>
+          <w:lang w:eastAsia="pt-BR"/>
+          <w14:ligatures w14:val="none"/>
+        </w:rPr>
+      </w:pPr>
+      <w:r>
+        <w:rPr>
+          <w:rFonts w:ascii="Arial" w:eastAsia="Times New Roman" w:hAnsi="Arial" w:cs="Arial"/>
+          <w:b/>
+          <w:bCs/>
+          <w:kern w:val="0"/>
+          <w:lang w:eastAsia="pt-BR"/>
+          <w14:ligatures w14:val="none"/>
+        </w:rPr>
+        <w:t xml:space="preserve">Gostaria que eu aplicasse este modelo para um </w:t>
+      </w:r>
+      <w:proofErr w:type="spellStart"/>
+      <w:r>
+        <w:rPr>
+          <w:rFonts w:ascii="Arial" w:eastAsia="Times New Roman" w:hAnsi="Arial" w:cs="Arial"/>
+          <w:b/>
+          <w:bCs/>
+          <w:kern w:val="0"/>
+          <w:lang w:eastAsia="pt-BR"/>
+          <w14:ligatures w14:val="none"/>
+        </w:rPr>
+        <w:t>clie</w:t>
+      </w:r>
+      <w:proofErr w:type="spellEnd"/>
+    </w:p>
+    <w:p>
+      <w:pPr>
+        <w:pStyle w:val="Ttulo1"/>
+        <w:rPr>
+          <w:rFonts w:ascii="Arial" w:hAnsi="Arial" w:cs="Arial"/>
+          <w:color w:val="auto"/>
+          <w:sz w:val="24"/>
+          <w:szCs w:val="24"/>
+        </w:rPr>
+      </w:pPr>
     </w:p>
     <w:sectPr>
-      <w:headerReference w:type="default" r:id="rId6"/>
+      <w:headerReference w:type="default" r:id="rId7"/>
       <w:pgSz w:w="11906" w:h="16838"/>
       <w:pgMar w:top="1417" w:right="1701" w:bottom="1417" w:left="1701" w:header="708" w:footer="708" w:gutter="0"/>
       <w:cols w:space="708"/>
@@ -102,13 +2997,1050 @@
   <w:p>
     <w:pPr>
       <w:pStyle w:val="Cabealho"/>
-      <w:jc w:val="center"/>
+    </w:pPr>
+  </w:p>
+  <w:p>
+    <w:pPr>
+      <w:pStyle w:val="Cabealho"/>
     </w:pPr>
     <w:r>
-      <w:t>Elm@2026</w:t>
+      <w:t>${logo}</w:t>
     </w:r>
   </w:p>
 </w:hdr>
+</file>
+
+<file path=word/numbering.xml><?xml version="1.0" encoding="utf-8"?>
+<w:numbering xmlns:wpc="http://schemas.microsoft.com/office/word/2010/wordprocessingCanvas" xmlns:cx="http://schemas.microsoft.com/office/drawing/2014/chartex" xmlns:cx1="http://schemas.microsoft.com/office/drawing/2015/9/8/chartex" xmlns:cx2="http://schemas.microsoft.com/office/drawing/2015/10/21/chartex" xmlns:cx3="http://schemas.microsoft.com/office/drawing/2016/5/9/chartex" xmlns:cx4="http://schemas.microsoft.com/office/drawing/2016/5/10/chartex" xmlns:cx5="http://schemas.microsoft.com/office/drawing/2016/5/11/chartex" xmlns:cx6="http://schemas.microsoft.com/office/drawing/2016/5/12/chartex" xmlns:cx7="http://schemas.microsoft.com/office/drawing/2016/5/13/chartex" xmlns:cx8="http://schemas.microsoft.com/office/drawing/2016/5/14/chartex" xmlns:mc="http://schemas.openxmlformats.org/markup-compatibility/2006" xmlns:aink="http://schemas.microsoft.com/office/drawing/2016/ink" xmlns:am3d="http://schemas.microsoft.com/office/drawing/2017/model3d" xmlns:o="urn:schemas-microsoft-com:office:office" xmlns:oel="http://schemas.microsoft.com/office/2019/extlst" xmlns:r="http://schemas.openxmlformats.org/officeDocument/2006/relationships" xmlns:m="http://schemas.openxmlformats.org/officeDocument/2006/math" xmlns:v="urn:schemas-microsoft-com:vml" xmlns:wp14="http://schemas.microsoft.com/office/word/2010/wordprocessingDrawing" xmlns:wp="http://schemas.openxmlformats.org/drawingml/2006/wordprocessingDrawing" xmlns:w10="urn:schemas-microsoft-com:office:word" xmlns:w="http://schemas.openxmlformats.org/wordprocessingml/2006/main" xmlns:w14="http://schemas.microsoft.com/office/word/2010/wordml" xmlns:w15="http://schemas.microsoft.com/office/word/2012/wordml" xmlns:w16cex="http://schemas.microsoft.com/office/word/2018/wordml/cex" xmlns:w16cid="http://schemas.microsoft.com/office/word/2016/wordml/cid" xmlns:w16="http://schemas.microsoft.com/office/word/2018/wordml" xmlns:w16sdtdh="http://schemas.microsoft.com/office/word/2020/wordml/sdtdatahash" xmlns:w16se="http://schemas.microsoft.com/office/word/2015/wordml/symex" xmlns:wpg="http://schemas.microsoft.com/office/word/2010/wordprocessingGroup" xmlns:wpi="http://schemas.microsoft.com/office/word/2010/wordprocessingInk" xmlns:wne="http://schemas.microsoft.com/office/word/2006/wordml" xmlns:wps="http://schemas.microsoft.com/office/word/2010/wordprocessingShape" mc:Ignorable="w14 w15 w16se w16cid w16 w16cex w16sdtdh wp14">
+  <w:abstractNum w:abstractNumId="0" w15:restartNumberingAfterBreak="0">
+    <w:nsid w:val="011D735D"/>
+    <w:multiLevelType w:val="multilevel"/>
+    <w:tmpl w:val="2DDCD146"/>
+    <w:lvl w:ilvl="0">
+      <w:start w:val="1"/>
+      <w:numFmt w:val="bullet"/>
+      <w:lvlText w:val=""/>
+      <w:lvlJc w:val="left"/>
+      <w:pPr>
+        <w:tabs>
+          <w:tab w:val="num" w:pos="720"/>
+        </w:tabs>
+        <w:ind w:left="720" w:hanging="360"/>
+      </w:pPr>
+      <w:rPr>
+        <w:rFonts w:ascii="Symbol" w:hAnsi="Symbol" w:hint="default"/>
+        <w:sz w:val="20"/>
+      </w:rPr>
+    </w:lvl>
+    <w:lvl w:ilvl="1" w:tentative="1">
+      <w:start w:val="1"/>
+      <w:numFmt w:val="bullet"/>
+      <w:lvlText w:val="o"/>
+      <w:lvlJc w:val="left"/>
+      <w:pPr>
+        <w:tabs>
+          <w:tab w:val="num" w:pos="1440"/>
+        </w:tabs>
+        <w:ind w:left="1440" w:hanging="360"/>
+      </w:pPr>
+      <w:rPr>
+        <w:rFonts w:ascii="Courier New" w:hAnsi="Courier New" w:hint="default"/>
+        <w:sz w:val="20"/>
+      </w:rPr>
+    </w:lvl>
+    <w:lvl w:ilvl="2" w:tentative="1">
+      <w:start w:val="1"/>
+      <w:numFmt w:val="bullet"/>
+      <w:lvlText w:val=""/>
+      <w:lvlJc w:val="left"/>
+      <w:pPr>
+        <w:tabs>
+          <w:tab w:val="num" w:pos="2160"/>
+        </w:tabs>
+        <w:ind w:left="2160" w:hanging="360"/>
+      </w:pPr>
+      <w:rPr>
+        <w:rFonts w:ascii="Wingdings" w:hAnsi="Wingdings" w:hint="default"/>
+        <w:sz w:val="20"/>
+      </w:rPr>
+    </w:lvl>
+    <w:lvl w:ilvl="3" w:tentative="1">
+      <w:start w:val="1"/>
+      <w:numFmt w:val="bullet"/>
+      <w:lvlText w:val=""/>
+      <w:lvlJc w:val="left"/>
+      <w:pPr>
+        <w:tabs>
+          <w:tab w:val="num" w:pos="2880"/>
+        </w:tabs>
+        <w:ind w:left="2880" w:hanging="360"/>
+      </w:pPr>
+      <w:rPr>
+        <w:rFonts w:ascii="Wingdings" w:hAnsi="Wingdings" w:hint="default"/>
+        <w:sz w:val="20"/>
+      </w:rPr>
+    </w:lvl>
+    <w:lvl w:ilvl="4" w:tentative="1">
+      <w:start w:val="1"/>
+      <w:numFmt w:val="bullet"/>
+      <w:lvlText w:val=""/>
+      <w:lvlJc w:val="left"/>
+      <w:pPr>
+        <w:tabs>
+          <w:tab w:val="num" w:pos="3600"/>
+        </w:tabs>
+        <w:ind w:left="3600" w:hanging="360"/>
+      </w:pPr>
+      <w:rPr>
+        <w:rFonts w:ascii="Wingdings" w:hAnsi="Wingdings" w:hint="default"/>
+        <w:sz w:val="20"/>
+      </w:rPr>
+    </w:lvl>
+    <w:lvl w:ilvl="5" w:tentative="1">
+      <w:start w:val="1"/>
+      <w:numFmt w:val="bullet"/>
+      <w:lvlText w:val=""/>
+      <w:lvlJc w:val="left"/>
+      <w:pPr>
+        <w:tabs>
+          <w:tab w:val="num" w:pos="4320"/>
+        </w:tabs>
+        <w:ind w:left="4320" w:hanging="360"/>
+      </w:pPr>
+      <w:rPr>
+        <w:rFonts w:ascii="Wingdings" w:hAnsi="Wingdings" w:hint="default"/>
+        <w:sz w:val="20"/>
+      </w:rPr>
+    </w:lvl>
+    <w:lvl w:ilvl="6" w:tentative="1">
+      <w:start w:val="1"/>
+      <w:numFmt w:val="bullet"/>
+      <w:lvlText w:val=""/>
+      <w:lvlJc w:val="left"/>
+      <w:pPr>
+        <w:tabs>
+          <w:tab w:val="num" w:pos="5040"/>
+        </w:tabs>
+        <w:ind w:left="5040" w:hanging="360"/>
+      </w:pPr>
+      <w:rPr>
+        <w:rFonts w:ascii="Wingdings" w:hAnsi="Wingdings" w:hint="default"/>
+        <w:sz w:val="20"/>
+      </w:rPr>
+    </w:lvl>
+    <w:lvl w:ilvl="7" w:tentative="1">
+      <w:start w:val="1"/>
+      <w:numFmt w:val="bullet"/>
+      <w:lvlText w:val=""/>
+      <w:lvlJc w:val="left"/>
+      <w:pPr>
+        <w:tabs>
+          <w:tab w:val="num" w:pos="5760"/>
+        </w:tabs>
+        <w:ind w:left="5760" w:hanging="360"/>
+      </w:pPr>
+      <w:rPr>
+        <w:rFonts w:ascii="Wingdings" w:hAnsi="Wingdings" w:hint="default"/>
+        <w:sz w:val="20"/>
+      </w:rPr>
+    </w:lvl>
+    <w:lvl w:ilvl="8" w:tentative="1">
+      <w:start w:val="1"/>
+      <w:numFmt w:val="bullet"/>
+      <w:lvlText w:val=""/>
+      <w:lvlJc w:val="left"/>
+      <w:pPr>
+        <w:tabs>
+          <w:tab w:val="num" w:pos="6480"/>
+        </w:tabs>
+        <w:ind w:left="6480" w:hanging="360"/>
+      </w:pPr>
+      <w:rPr>
+        <w:rFonts w:ascii="Wingdings" w:hAnsi="Wingdings" w:hint="default"/>
+        <w:sz w:val="20"/>
+      </w:rPr>
+    </w:lvl>
+  </w:abstractNum>
+  <w:abstractNum w:abstractNumId="1" w15:restartNumberingAfterBreak="0">
+    <w:nsid w:val="16D76EF5"/>
+    <w:multiLevelType w:val="multilevel"/>
+    <w:tmpl w:val="FAB208EA"/>
+    <w:lvl w:ilvl="0">
+      <w:start w:val="1"/>
+      <w:numFmt w:val="bullet"/>
+      <w:lvlText w:val=""/>
+      <w:lvlJc w:val="left"/>
+      <w:pPr>
+        <w:tabs>
+          <w:tab w:val="num" w:pos="720"/>
+        </w:tabs>
+        <w:ind w:left="720" w:hanging="360"/>
+      </w:pPr>
+      <w:rPr>
+        <w:rFonts w:ascii="Symbol" w:hAnsi="Symbol" w:hint="default"/>
+        <w:sz w:val="20"/>
+      </w:rPr>
+    </w:lvl>
+    <w:lvl w:ilvl="1" w:tentative="1">
+      <w:start w:val="1"/>
+      <w:numFmt w:val="bullet"/>
+      <w:lvlText w:val="o"/>
+      <w:lvlJc w:val="left"/>
+      <w:pPr>
+        <w:tabs>
+          <w:tab w:val="num" w:pos="1440"/>
+        </w:tabs>
+        <w:ind w:left="1440" w:hanging="360"/>
+      </w:pPr>
+      <w:rPr>
+        <w:rFonts w:ascii="Courier New" w:hAnsi="Courier New" w:hint="default"/>
+        <w:sz w:val="20"/>
+      </w:rPr>
+    </w:lvl>
+    <w:lvl w:ilvl="2" w:tentative="1">
+      <w:start w:val="1"/>
+      <w:numFmt w:val="bullet"/>
+      <w:lvlText w:val=""/>
+      <w:lvlJc w:val="left"/>
+      <w:pPr>
+        <w:tabs>
+          <w:tab w:val="num" w:pos="2160"/>
+        </w:tabs>
+        <w:ind w:left="2160" w:hanging="360"/>
+      </w:pPr>
+      <w:rPr>
+        <w:rFonts w:ascii="Wingdings" w:hAnsi="Wingdings" w:hint="default"/>
+        <w:sz w:val="20"/>
+      </w:rPr>
+    </w:lvl>
+    <w:lvl w:ilvl="3" w:tentative="1">
+      <w:start w:val="1"/>
+      <w:numFmt w:val="bullet"/>
+      <w:lvlText w:val=""/>
+      <w:lvlJc w:val="left"/>
+      <w:pPr>
+        <w:tabs>
+          <w:tab w:val="num" w:pos="2880"/>
+        </w:tabs>
+        <w:ind w:left="2880" w:hanging="360"/>
+      </w:pPr>
+      <w:rPr>
+        <w:rFonts w:ascii="Wingdings" w:hAnsi="Wingdings" w:hint="default"/>
+        <w:sz w:val="20"/>
+      </w:rPr>
+    </w:lvl>
+    <w:lvl w:ilvl="4" w:tentative="1">
+      <w:start w:val="1"/>
+      <w:numFmt w:val="bullet"/>
+      <w:lvlText w:val=""/>
+      <w:lvlJc w:val="left"/>
+      <w:pPr>
+        <w:tabs>
+          <w:tab w:val="num" w:pos="3600"/>
+        </w:tabs>
+        <w:ind w:left="3600" w:hanging="360"/>
+      </w:pPr>
+      <w:rPr>
+        <w:rFonts w:ascii="Wingdings" w:hAnsi="Wingdings" w:hint="default"/>
+        <w:sz w:val="20"/>
+      </w:rPr>
+    </w:lvl>
+    <w:lvl w:ilvl="5" w:tentative="1">
+      <w:start w:val="1"/>
+      <w:numFmt w:val="bullet"/>
+      <w:lvlText w:val=""/>
+      <w:lvlJc w:val="left"/>
+      <w:pPr>
+        <w:tabs>
+          <w:tab w:val="num" w:pos="4320"/>
+        </w:tabs>
+        <w:ind w:left="4320" w:hanging="360"/>
+      </w:pPr>
+      <w:rPr>
+        <w:rFonts w:ascii="Wingdings" w:hAnsi="Wingdings" w:hint="default"/>
+        <w:sz w:val="20"/>
+      </w:rPr>
+    </w:lvl>
+    <w:lvl w:ilvl="6" w:tentative="1">
+      <w:start w:val="1"/>
+      <w:numFmt w:val="bullet"/>
+      <w:lvlText w:val=""/>
+      <w:lvlJc w:val="left"/>
+      <w:pPr>
+        <w:tabs>
+          <w:tab w:val="num" w:pos="5040"/>
+        </w:tabs>
+        <w:ind w:left="5040" w:hanging="360"/>
+      </w:pPr>
+      <w:rPr>
+        <w:rFonts w:ascii="Wingdings" w:hAnsi="Wingdings" w:hint="default"/>
+        <w:sz w:val="20"/>
+      </w:rPr>
+    </w:lvl>
+    <w:lvl w:ilvl="7" w:tentative="1">
+      <w:start w:val="1"/>
+      <w:numFmt w:val="bullet"/>
+      <w:lvlText w:val=""/>
+      <w:lvlJc w:val="left"/>
+      <w:pPr>
+        <w:tabs>
+          <w:tab w:val="num" w:pos="5760"/>
+        </w:tabs>
+        <w:ind w:left="5760" w:hanging="360"/>
+      </w:pPr>
+      <w:rPr>
+        <w:rFonts w:ascii="Wingdings" w:hAnsi="Wingdings" w:hint="default"/>
+        <w:sz w:val="20"/>
+      </w:rPr>
+    </w:lvl>
+    <w:lvl w:ilvl="8" w:tentative="1">
+      <w:start w:val="1"/>
+      <w:numFmt w:val="bullet"/>
+      <w:lvlText w:val=""/>
+      <w:lvlJc w:val="left"/>
+      <w:pPr>
+        <w:tabs>
+          <w:tab w:val="num" w:pos="6480"/>
+        </w:tabs>
+        <w:ind w:left="6480" w:hanging="360"/>
+      </w:pPr>
+      <w:rPr>
+        <w:rFonts w:ascii="Wingdings" w:hAnsi="Wingdings" w:hint="default"/>
+        <w:sz w:val="20"/>
+      </w:rPr>
+    </w:lvl>
+  </w:abstractNum>
+  <w:abstractNum w:abstractNumId="2" w15:restartNumberingAfterBreak="0">
+    <w:nsid w:val="27244F80"/>
+    <w:multiLevelType w:val="multilevel"/>
+    <w:tmpl w:val="2F30D30A"/>
+    <w:lvl w:ilvl="0">
+      <w:start w:val="1"/>
+      <w:numFmt w:val="bullet"/>
+      <w:lvlText w:val=""/>
+      <w:lvlJc w:val="left"/>
+      <w:pPr>
+        <w:tabs>
+          <w:tab w:val="num" w:pos="720"/>
+        </w:tabs>
+        <w:ind w:left="720" w:hanging="360"/>
+      </w:pPr>
+      <w:rPr>
+        <w:rFonts w:ascii="Symbol" w:hAnsi="Symbol" w:hint="default"/>
+        <w:sz w:val="20"/>
+      </w:rPr>
+    </w:lvl>
+    <w:lvl w:ilvl="1" w:tentative="1">
+      <w:start w:val="1"/>
+      <w:numFmt w:val="bullet"/>
+      <w:lvlText w:val="o"/>
+      <w:lvlJc w:val="left"/>
+      <w:pPr>
+        <w:tabs>
+          <w:tab w:val="num" w:pos="1440"/>
+        </w:tabs>
+        <w:ind w:left="1440" w:hanging="360"/>
+      </w:pPr>
+      <w:rPr>
+        <w:rFonts w:ascii="Courier New" w:hAnsi="Courier New" w:hint="default"/>
+        <w:sz w:val="20"/>
+      </w:rPr>
+    </w:lvl>
+    <w:lvl w:ilvl="2" w:tentative="1">
+      <w:start w:val="1"/>
+      <w:numFmt w:val="bullet"/>
+      <w:lvlText w:val=""/>
+      <w:lvlJc w:val="left"/>
+      <w:pPr>
+        <w:tabs>
+          <w:tab w:val="num" w:pos="2160"/>
+        </w:tabs>
+        <w:ind w:left="2160" w:hanging="360"/>
+      </w:pPr>
+      <w:rPr>
+        <w:rFonts w:ascii="Wingdings" w:hAnsi="Wingdings" w:hint="default"/>
+        <w:sz w:val="20"/>
+      </w:rPr>
+    </w:lvl>
+    <w:lvl w:ilvl="3" w:tentative="1">
+      <w:start w:val="1"/>
+      <w:numFmt w:val="bullet"/>
+      <w:lvlText w:val=""/>
+      <w:lvlJc w:val="left"/>
+      <w:pPr>
+        <w:tabs>
+          <w:tab w:val="num" w:pos="2880"/>
+        </w:tabs>
+        <w:ind w:left="2880" w:hanging="360"/>
+      </w:pPr>
+      <w:rPr>
+        <w:rFonts w:ascii="Wingdings" w:hAnsi="Wingdings" w:hint="default"/>
+        <w:sz w:val="20"/>
+      </w:rPr>
+    </w:lvl>
+    <w:lvl w:ilvl="4" w:tentative="1">
+      <w:start w:val="1"/>
+      <w:numFmt w:val="bullet"/>
+      <w:lvlText w:val=""/>
+      <w:lvlJc w:val="left"/>
+      <w:pPr>
+        <w:tabs>
+          <w:tab w:val="num" w:pos="3600"/>
+        </w:tabs>
+        <w:ind w:left="3600" w:hanging="360"/>
+      </w:pPr>
+      <w:rPr>
+        <w:rFonts w:ascii="Wingdings" w:hAnsi="Wingdings" w:hint="default"/>
+        <w:sz w:val="20"/>
+      </w:rPr>
+    </w:lvl>
+    <w:lvl w:ilvl="5" w:tentative="1">
+      <w:start w:val="1"/>
+      <w:numFmt w:val="bullet"/>
+      <w:lvlText w:val=""/>
+      <w:lvlJc w:val="left"/>
+      <w:pPr>
+        <w:tabs>
+          <w:tab w:val="num" w:pos="4320"/>
+        </w:tabs>
+        <w:ind w:left="4320" w:hanging="360"/>
+      </w:pPr>
+      <w:rPr>
+        <w:rFonts w:ascii="Wingdings" w:hAnsi="Wingdings" w:hint="default"/>
+        <w:sz w:val="20"/>
+      </w:rPr>
+    </w:lvl>
+    <w:lvl w:ilvl="6" w:tentative="1">
+      <w:start w:val="1"/>
+      <w:numFmt w:val="bullet"/>
+      <w:lvlText w:val=""/>
+      <w:lvlJc w:val="left"/>
+      <w:pPr>
+        <w:tabs>
+          <w:tab w:val="num" w:pos="5040"/>
+        </w:tabs>
+        <w:ind w:left="5040" w:hanging="360"/>
+      </w:pPr>
+      <w:rPr>
+        <w:rFonts w:ascii="Wingdings" w:hAnsi="Wingdings" w:hint="default"/>
+        <w:sz w:val="20"/>
+      </w:rPr>
+    </w:lvl>
+    <w:lvl w:ilvl="7" w:tentative="1">
+      <w:start w:val="1"/>
+      <w:numFmt w:val="bullet"/>
+      <w:lvlText w:val=""/>
+      <w:lvlJc w:val="left"/>
+      <w:pPr>
+        <w:tabs>
+          <w:tab w:val="num" w:pos="5760"/>
+        </w:tabs>
+        <w:ind w:left="5760" w:hanging="360"/>
+      </w:pPr>
+      <w:rPr>
+        <w:rFonts w:ascii="Wingdings" w:hAnsi="Wingdings" w:hint="default"/>
+        <w:sz w:val="20"/>
+      </w:rPr>
+    </w:lvl>
+    <w:lvl w:ilvl="8" w:tentative="1">
+      <w:start w:val="1"/>
+      <w:numFmt w:val="bullet"/>
+      <w:lvlText w:val=""/>
+      <w:lvlJc w:val="left"/>
+      <w:pPr>
+        <w:tabs>
+          <w:tab w:val="num" w:pos="6480"/>
+        </w:tabs>
+        <w:ind w:left="6480" w:hanging="360"/>
+      </w:pPr>
+      <w:rPr>
+        <w:rFonts w:ascii="Wingdings" w:hAnsi="Wingdings" w:hint="default"/>
+        <w:sz w:val="20"/>
+      </w:rPr>
+    </w:lvl>
+  </w:abstractNum>
+  <w:abstractNum w:abstractNumId="3" w15:restartNumberingAfterBreak="0">
+    <w:nsid w:val="322318AB"/>
+    <w:multiLevelType w:val="hybridMultilevel"/>
+    <w:tmpl w:val="317CC7D4"/>
+    <w:lvl w:ilvl="0" w:tplc="04160001">
+      <w:start w:val="1"/>
+      <w:numFmt w:val="bullet"/>
+      <w:lvlText w:val=""/>
+      <w:lvlJc w:val="left"/>
+      <w:pPr>
+        <w:ind w:left="720" w:hanging="360"/>
+      </w:pPr>
+      <w:rPr>
+        <w:rFonts w:ascii="Symbol" w:hAnsi="Symbol" w:hint="default"/>
+      </w:rPr>
+    </w:lvl>
+    <w:lvl w:ilvl="1" w:tplc="04160003" w:tentative="1">
+      <w:start w:val="1"/>
+      <w:numFmt w:val="bullet"/>
+      <w:lvlText w:val="o"/>
+      <w:lvlJc w:val="left"/>
+      <w:pPr>
+        <w:ind w:left="1440" w:hanging="360"/>
+      </w:pPr>
+      <w:rPr>
+        <w:rFonts w:ascii="Courier New" w:hAnsi="Courier New" w:cs="Courier New" w:hint="default"/>
+      </w:rPr>
+    </w:lvl>
+    <w:lvl w:ilvl="2" w:tplc="04160005" w:tentative="1">
+      <w:start w:val="1"/>
+      <w:numFmt w:val="bullet"/>
+      <w:lvlText w:val=""/>
+      <w:lvlJc w:val="left"/>
+      <w:pPr>
+        <w:ind w:left="2160" w:hanging="360"/>
+      </w:pPr>
+      <w:rPr>
+        <w:rFonts w:ascii="Wingdings" w:hAnsi="Wingdings" w:hint="default"/>
+      </w:rPr>
+    </w:lvl>
+    <w:lvl w:ilvl="3" w:tplc="04160001" w:tentative="1">
+      <w:start w:val="1"/>
+      <w:numFmt w:val="bullet"/>
+      <w:lvlText w:val=""/>
+      <w:lvlJc w:val="left"/>
+      <w:pPr>
+        <w:ind w:left="2880" w:hanging="360"/>
+      </w:pPr>
+      <w:rPr>
+        <w:rFonts w:ascii="Symbol" w:hAnsi="Symbol" w:hint="default"/>
+      </w:rPr>
+    </w:lvl>
+    <w:lvl w:ilvl="4" w:tplc="04160003" w:tentative="1">
+      <w:start w:val="1"/>
+      <w:numFmt w:val="bullet"/>
+      <w:lvlText w:val="o"/>
+      <w:lvlJc w:val="left"/>
+      <w:pPr>
+        <w:ind w:left="3600" w:hanging="360"/>
+      </w:pPr>
+      <w:rPr>
+        <w:rFonts w:ascii="Courier New" w:hAnsi="Courier New" w:cs="Courier New" w:hint="default"/>
+      </w:rPr>
+    </w:lvl>
+    <w:lvl w:ilvl="5" w:tplc="04160005" w:tentative="1">
+      <w:start w:val="1"/>
+      <w:numFmt w:val="bullet"/>
+      <w:lvlText w:val=""/>
+      <w:lvlJc w:val="left"/>
+      <w:pPr>
+        <w:ind w:left="4320" w:hanging="360"/>
+      </w:pPr>
+      <w:rPr>
+        <w:rFonts w:ascii="Wingdings" w:hAnsi="Wingdings" w:hint="default"/>
+      </w:rPr>
+    </w:lvl>
+    <w:lvl w:ilvl="6" w:tplc="04160001" w:tentative="1">
+      <w:start w:val="1"/>
+      <w:numFmt w:val="bullet"/>
+      <w:lvlText w:val=""/>
+      <w:lvlJc w:val="left"/>
+      <w:pPr>
+        <w:ind w:left="5040" w:hanging="360"/>
+      </w:pPr>
+      <w:rPr>
+        <w:rFonts w:ascii="Symbol" w:hAnsi="Symbol" w:hint="default"/>
+      </w:rPr>
+    </w:lvl>
+    <w:lvl w:ilvl="7" w:tplc="04160003" w:tentative="1">
+      <w:start w:val="1"/>
+      <w:numFmt w:val="bullet"/>
+      <w:lvlText w:val="o"/>
+      <w:lvlJc w:val="left"/>
+      <w:pPr>
+        <w:ind w:left="5760" w:hanging="360"/>
+      </w:pPr>
+      <w:rPr>
+        <w:rFonts w:ascii="Courier New" w:hAnsi="Courier New" w:cs="Courier New" w:hint="default"/>
+      </w:rPr>
+    </w:lvl>
+    <w:lvl w:ilvl="8" w:tplc="04160005" w:tentative="1">
+      <w:start w:val="1"/>
+      <w:numFmt w:val="bullet"/>
+      <w:lvlText w:val=""/>
+      <w:lvlJc w:val="left"/>
+      <w:pPr>
+        <w:ind w:left="6480" w:hanging="360"/>
+      </w:pPr>
+      <w:rPr>
+        <w:rFonts w:ascii="Wingdings" w:hAnsi="Wingdings" w:hint="default"/>
+      </w:rPr>
+    </w:lvl>
+  </w:abstractNum>
+  <w:abstractNum w:abstractNumId="4" w15:restartNumberingAfterBreak="0">
+    <w:nsid w:val="5FA6345B"/>
+    <w:multiLevelType w:val="multilevel"/>
+    <w:tmpl w:val="9932B5F6"/>
+    <w:lvl w:ilvl="0">
+      <w:start w:val="1"/>
+      <w:numFmt w:val="bullet"/>
+      <w:lvlText w:val=""/>
+      <w:lvlJc w:val="left"/>
+      <w:pPr>
+        <w:tabs>
+          <w:tab w:val="num" w:pos="720"/>
+        </w:tabs>
+        <w:ind w:left="720" w:hanging="360"/>
+      </w:pPr>
+      <w:rPr>
+        <w:rFonts w:ascii="Symbol" w:hAnsi="Symbol" w:hint="default"/>
+        <w:sz w:val="20"/>
+      </w:rPr>
+    </w:lvl>
+    <w:lvl w:ilvl="1" w:tentative="1">
+      <w:start w:val="1"/>
+      <w:numFmt w:val="bullet"/>
+      <w:lvlText w:val="o"/>
+      <w:lvlJc w:val="left"/>
+      <w:pPr>
+        <w:tabs>
+          <w:tab w:val="num" w:pos="1440"/>
+        </w:tabs>
+        <w:ind w:left="1440" w:hanging="360"/>
+      </w:pPr>
+      <w:rPr>
+        <w:rFonts w:ascii="Courier New" w:hAnsi="Courier New" w:hint="default"/>
+        <w:sz w:val="20"/>
+      </w:rPr>
+    </w:lvl>
+    <w:lvl w:ilvl="2" w:tentative="1">
+      <w:start w:val="1"/>
+      <w:numFmt w:val="bullet"/>
+      <w:lvlText w:val=""/>
+      <w:lvlJc w:val="left"/>
+      <w:pPr>
+        <w:tabs>
+          <w:tab w:val="num" w:pos="2160"/>
+        </w:tabs>
+        <w:ind w:left="2160" w:hanging="360"/>
+      </w:pPr>
+      <w:rPr>
+        <w:rFonts w:ascii="Wingdings" w:hAnsi="Wingdings" w:hint="default"/>
+        <w:sz w:val="20"/>
+      </w:rPr>
+    </w:lvl>
+    <w:lvl w:ilvl="3" w:tentative="1">
+      <w:start w:val="1"/>
+      <w:numFmt w:val="bullet"/>
+      <w:lvlText w:val=""/>
+      <w:lvlJc w:val="left"/>
+      <w:pPr>
+        <w:tabs>
+          <w:tab w:val="num" w:pos="2880"/>
+        </w:tabs>
+        <w:ind w:left="2880" w:hanging="360"/>
+      </w:pPr>
+      <w:rPr>
+        <w:rFonts w:ascii="Wingdings" w:hAnsi="Wingdings" w:hint="default"/>
+        <w:sz w:val="20"/>
+      </w:rPr>
+    </w:lvl>
+    <w:lvl w:ilvl="4" w:tentative="1">
+      <w:start w:val="1"/>
+      <w:numFmt w:val="bullet"/>
+      <w:lvlText w:val=""/>
+      <w:lvlJc w:val="left"/>
+      <w:pPr>
+        <w:tabs>
+          <w:tab w:val="num" w:pos="3600"/>
+        </w:tabs>
+        <w:ind w:left="3600" w:hanging="360"/>
+      </w:pPr>
+      <w:rPr>
+        <w:rFonts w:ascii="Wingdings" w:hAnsi="Wingdings" w:hint="default"/>
+        <w:sz w:val="20"/>
+      </w:rPr>
+    </w:lvl>
+    <w:lvl w:ilvl="5" w:tentative="1">
+      <w:start w:val="1"/>
+      <w:numFmt w:val="bullet"/>
+      <w:lvlText w:val=""/>
+      <w:lvlJc w:val="left"/>
+      <w:pPr>
+        <w:tabs>
+          <w:tab w:val="num" w:pos="4320"/>
+        </w:tabs>
+        <w:ind w:left="4320" w:hanging="360"/>
+      </w:pPr>
+      <w:rPr>
+        <w:rFonts w:ascii="Wingdings" w:hAnsi="Wingdings" w:hint="default"/>
+        <w:sz w:val="20"/>
+      </w:rPr>
+    </w:lvl>
+    <w:lvl w:ilvl="6" w:tentative="1">
+      <w:start w:val="1"/>
+      <w:numFmt w:val="bullet"/>
+      <w:lvlText w:val=""/>
+      <w:lvlJc w:val="left"/>
+      <w:pPr>
+        <w:tabs>
+          <w:tab w:val="num" w:pos="5040"/>
+        </w:tabs>
+        <w:ind w:left="5040" w:hanging="360"/>
+      </w:pPr>
+      <w:rPr>
+        <w:rFonts w:ascii="Wingdings" w:hAnsi="Wingdings" w:hint="default"/>
+        <w:sz w:val="20"/>
+      </w:rPr>
+    </w:lvl>
+    <w:lvl w:ilvl="7" w:tentative="1">
+      <w:start w:val="1"/>
+      <w:numFmt w:val="bullet"/>
+      <w:lvlText w:val=""/>
+      <w:lvlJc w:val="left"/>
+      <w:pPr>
+        <w:tabs>
+          <w:tab w:val="num" w:pos="5760"/>
+        </w:tabs>
+        <w:ind w:left="5760" w:hanging="360"/>
+      </w:pPr>
+      <w:rPr>
+        <w:rFonts w:ascii="Wingdings" w:hAnsi="Wingdings" w:hint="default"/>
+        <w:sz w:val="20"/>
+      </w:rPr>
+    </w:lvl>
+    <w:lvl w:ilvl="8" w:tentative="1">
+      <w:start w:val="1"/>
+      <w:numFmt w:val="bullet"/>
+      <w:lvlText w:val=""/>
+      <w:lvlJc w:val="left"/>
+      <w:pPr>
+        <w:tabs>
+          <w:tab w:val="num" w:pos="6480"/>
+        </w:tabs>
+        <w:ind w:left="6480" w:hanging="360"/>
+      </w:pPr>
+      <w:rPr>
+        <w:rFonts w:ascii="Wingdings" w:hAnsi="Wingdings" w:hint="default"/>
+        <w:sz w:val="20"/>
+      </w:rPr>
+    </w:lvl>
+  </w:abstractNum>
+  <w:abstractNum w:abstractNumId="5" w15:restartNumberingAfterBreak="0">
+    <w:nsid w:val="61302737"/>
+    <w:multiLevelType w:val="multilevel"/>
+    <w:tmpl w:val="3B5462C2"/>
+    <w:lvl w:ilvl="0">
+      <w:start w:val="1"/>
+      <w:numFmt w:val="bullet"/>
+      <w:lvlText w:val=""/>
+      <w:lvlJc w:val="left"/>
+      <w:pPr>
+        <w:tabs>
+          <w:tab w:val="num" w:pos="720"/>
+        </w:tabs>
+        <w:ind w:left="720" w:hanging="360"/>
+      </w:pPr>
+      <w:rPr>
+        <w:rFonts w:ascii="Symbol" w:hAnsi="Symbol" w:hint="default"/>
+        <w:sz w:val="20"/>
+      </w:rPr>
+    </w:lvl>
+    <w:lvl w:ilvl="1" w:tentative="1">
+      <w:start w:val="1"/>
+      <w:numFmt w:val="bullet"/>
+      <w:lvlText w:val="o"/>
+      <w:lvlJc w:val="left"/>
+      <w:pPr>
+        <w:tabs>
+          <w:tab w:val="num" w:pos="1440"/>
+        </w:tabs>
+        <w:ind w:left="1440" w:hanging="360"/>
+      </w:pPr>
+      <w:rPr>
+        <w:rFonts w:ascii="Courier New" w:hAnsi="Courier New" w:hint="default"/>
+        <w:sz w:val="20"/>
+      </w:rPr>
+    </w:lvl>
+    <w:lvl w:ilvl="2" w:tentative="1">
+      <w:start w:val="1"/>
+      <w:numFmt w:val="bullet"/>
+      <w:lvlText w:val=""/>
+      <w:lvlJc w:val="left"/>
+      <w:pPr>
+        <w:tabs>
+          <w:tab w:val="num" w:pos="2160"/>
+        </w:tabs>
+        <w:ind w:left="2160" w:hanging="360"/>
+      </w:pPr>
+      <w:rPr>
+        <w:rFonts w:ascii="Wingdings" w:hAnsi="Wingdings" w:hint="default"/>
+        <w:sz w:val="20"/>
+      </w:rPr>
+    </w:lvl>
+    <w:lvl w:ilvl="3" w:tentative="1">
+      <w:start w:val="1"/>
+      <w:numFmt w:val="bullet"/>
+      <w:lvlText w:val=""/>
+      <w:lvlJc w:val="left"/>
+      <w:pPr>
+        <w:tabs>
+          <w:tab w:val="num" w:pos="2880"/>
+        </w:tabs>
+        <w:ind w:left="2880" w:hanging="360"/>
+      </w:pPr>
+      <w:rPr>
+        <w:rFonts w:ascii="Wingdings" w:hAnsi="Wingdings" w:hint="default"/>
+        <w:sz w:val="20"/>
+      </w:rPr>
+    </w:lvl>
+    <w:lvl w:ilvl="4" w:tentative="1">
+      <w:start w:val="1"/>
+      <w:numFmt w:val="bullet"/>
+      <w:lvlText w:val=""/>
+      <w:lvlJc w:val="left"/>
+      <w:pPr>
+        <w:tabs>
+          <w:tab w:val="num" w:pos="3600"/>
+        </w:tabs>
+        <w:ind w:left="3600" w:hanging="360"/>
+      </w:pPr>
+      <w:rPr>
+        <w:rFonts w:ascii="Wingdings" w:hAnsi="Wingdings" w:hint="default"/>
+        <w:sz w:val="20"/>
+      </w:rPr>
+    </w:lvl>
+    <w:lvl w:ilvl="5" w:tentative="1">
+      <w:start w:val="1"/>
+      <w:numFmt w:val="bullet"/>
+      <w:lvlText w:val=""/>
+      <w:lvlJc w:val="left"/>
+      <w:pPr>
+        <w:tabs>
+          <w:tab w:val="num" w:pos="4320"/>
+        </w:tabs>
+        <w:ind w:left="4320" w:hanging="360"/>
+      </w:pPr>
+      <w:rPr>
+        <w:rFonts w:ascii="Wingdings" w:hAnsi="Wingdings" w:hint="default"/>
+        <w:sz w:val="20"/>
+      </w:rPr>
+    </w:lvl>
+    <w:lvl w:ilvl="6" w:tentative="1">
+      <w:start w:val="1"/>
+      <w:numFmt w:val="bullet"/>
+      <w:lvlText w:val=""/>
+      <w:lvlJc w:val="left"/>
+      <w:pPr>
+        <w:tabs>
+          <w:tab w:val="num" w:pos="5040"/>
+        </w:tabs>
+        <w:ind w:left="5040" w:hanging="360"/>
+      </w:pPr>
+      <w:rPr>
+        <w:rFonts w:ascii="Wingdings" w:hAnsi="Wingdings" w:hint="default"/>
+        <w:sz w:val="20"/>
+      </w:rPr>
+    </w:lvl>
+    <w:lvl w:ilvl="7" w:tentative="1">
+      <w:start w:val="1"/>
+      <w:numFmt w:val="bullet"/>
+      <w:lvlText w:val=""/>
+      <w:lvlJc w:val="left"/>
+      <w:pPr>
+        <w:tabs>
+          <w:tab w:val="num" w:pos="5760"/>
+        </w:tabs>
+        <w:ind w:left="5760" w:hanging="360"/>
+      </w:pPr>
+      <w:rPr>
+        <w:rFonts w:ascii="Wingdings" w:hAnsi="Wingdings" w:hint="default"/>
+        <w:sz w:val="20"/>
+      </w:rPr>
+    </w:lvl>
+    <w:lvl w:ilvl="8" w:tentative="1">
+      <w:start w:val="1"/>
+      <w:numFmt w:val="bullet"/>
+      <w:lvlText w:val=""/>
+      <w:lvlJc w:val="left"/>
+      <w:pPr>
+        <w:tabs>
+          <w:tab w:val="num" w:pos="6480"/>
+        </w:tabs>
+        <w:ind w:left="6480" w:hanging="360"/>
+      </w:pPr>
+      <w:rPr>
+        <w:rFonts w:ascii="Wingdings" w:hAnsi="Wingdings" w:hint="default"/>
+        <w:sz w:val="20"/>
+      </w:rPr>
+    </w:lvl>
+  </w:abstractNum>
+  <w:abstractNum w:abstractNumId="6" w15:restartNumberingAfterBreak="0">
+    <w:nsid w:val="72811B3F"/>
+    <w:multiLevelType w:val="multilevel"/>
+    <w:tmpl w:val="EAE277F6"/>
+    <w:lvl w:ilvl="0">
+      <w:start w:val="1"/>
+      <w:numFmt w:val="bullet"/>
+      <w:lvlText w:val=""/>
+      <w:lvlJc w:val="left"/>
+      <w:pPr>
+        <w:tabs>
+          <w:tab w:val="num" w:pos="720"/>
+        </w:tabs>
+        <w:ind w:left="720" w:hanging="360"/>
+      </w:pPr>
+      <w:rPr>
+        <w:rFonts w:ascii="Symbol" w:hAnsi="Symbol" w:hint="default"/>
+        <w:sz w:val="20"/>
+      </w:rPr>
+    </w:lvl>
+    <w:lvl w:ilvl="1" w:tentative="1">
+      <w:start w:val="1"/>
+      <w:numFmt w:val="bullet"/>
+      <w:lvlText w:val="o"/>
+      <w:lvlJc w:val="left"/>
+      <w:pPr>
+        <w:tabs>
+          <w:tab w:val="num" w:pos="1440"/>
+        </w:tabs>
+        <w:ind w:left="1440" w:hanging="360"/>
+      </w:pPr>
+      <w:rPr>
+        <w:rFonts w:ascii="Courier New" w:hAnsi="Courier New" w:hint="default"/>
+        <w:sz w:val="20"/>
+      </w:rPr>
+    </w:lvl>
+    <w:lvl w:ilvl="2" w:tentative="1">
+      <w:start w:val="1"/>
+      <w:numFmt w:val="bullet"/>
+      <w:lvlText w:val=""/>
+      <w:lvlJc w:val="left"/>
+      <w:pPr>
+        <w:tabs>
+          <w:tab w:val="num" w:pos="2160"/>
+        </w:tabs>
+        <w:ind w:left="2160" w:hanging="360"/>
+      </w:pPr>
+      <w:rPr>
+        <w:rFonts w:ascii="Wingdings" w:hAnsi="Wingdings" w:hint="default"/>
+        <w:sz w:val="20"/>
+      </w:rPr>
+    </w:lvl>
+    <w:lvl w:ilvl="3" w:tentative="1">
+      <w:start w:val="1"/>
+      <w:numFmt w:val="bullet"/>
+      <w:lvlText w:val=""/>
+      <w:lvlJc w:val="left"/>
+      <w:pPr>
+        <w:tabs>
+          <w:tab w:val="num" w:pos="2880"/>
+        </w:tabs>
+        <w:ind w:left="2880" w:hanging="360"/>
+      </w:pPr>
+      <w:rPr>
+        <w:rFonts w:ascii="Wingdings" w:hAnsi="Wingdings" w:hint="default"/>
+        <w:sz w:val="20"/>
+      </w:rPr>
+    </w:lvl>
+    <w:lvl w:ilvl="4" w:tentative="1">
+      <w:start w:val="1"/>
+      <w:numFmt w:val="bullet"/>
+      <w:lvlText w:val=""/>
+      <w:lvlJc w:val="left"/>
+      <w:pPr>
+        <w:tabs>
+          <w:tab w:val="num" w:pos="3600"/>
+        </w:tabs>
+        <w:ind w:left="3600" w:hanging="360"/>
+      </w:pPr>
+      <w:rPr>
+        <w:rFonts w:ascii="Wingdings" w:hAnsi="Wingdings" w:hint="default"/>
+        <w:sz w:val="20"/>
+      </w:rPr>
+    </w:lvl>
+    <w:lvl w:ilvl="5" w:tentative="1">
+      <w:start w:val="1"/>
+      <w:numFmt w:val="bullet"/>
+      <w:lvlText w:val=""/>
+      <w:lvlJc w:val="left"/>
+      <w:pPr>
+        <w:tabs>
+          <w:tab w:val="num" w:pos="4320"/>
+        </w:tabs>
+        <w:ind w:left="4320" w:hanging="360"/>
+      </w:pPr>
+      <w:rPr>
+        <w:rFonts w:ascii="Wingdings" w:hAnsi="Wingdings" w:hint="default"/>
+        <w:sz w:val="20"/>
+      </w:rPr>
+    </w:lvl>
+    <w:lvl w:ilvl="6" w:tentative="1">
+      <w:start w:val="1"/>
+      <w:numFmt w:val="bullet"/>
+      <w:lvlText w:val=""/>
+      <w:lvlJc w:val="left"/>
+      <w:pPr>
+        <w:tabs>
+          <w:tab w:val="num" w:pos="5040"/>
+        </w:tabs>
+        <w:ind w:left="5040" w:hanging="360"/>
+      </w:pPr>
+      <w:rPr>
+        <w:rFonts w:ascii="Wingdings" w:hAnsi="Wingdings" w:hint="default"/>
+        <w:sz w:val="20"/>
+      </w:rPr>
+    </w:lvl>
+    <w:lvl w:ilvl="7" w:tentative="1">
+      <w:start w:val="1"/>
+      <w:numFmt w:val="bullet"/>
+      <w:lvlText w:val=""/>
+      <w:lvlJc w:val="left"/>
+      <w:pPr>
+        <w:tabs>
+          <w:tab w:val="num" w:pos="5760"/>
+        </w:tabs>
+        <w:ind w:left="5760" w:hanging="360"/>
+      </w:pPr>
+      <w:rPr>
+        <w:rFonts w:ascii="Wingdings" w:hAnsi="Wingdings" w:hint="default"/>
+        <w:sz w:val="20"/>
+      </w:rPr>
+    </w:lvl>
+    <w:lvl w:ilvl="8" w:tentative="1">
+      <w:start w:val="1"/>
+      <w:numFmt w:val="bullet"/>
+      <w:lvlText w:val=""/>
+      <w:lvlJc w:val="left"/>
+      <w:pPr>
+        <w:tabs>
+          <w:tab w:val="num" w:pos="6480"/>
+        </w:tabs>
+        <w:ind w:left="6480" w:hanging="360"/>
+      </w:pPr>
+      <w:rPr>
+        <w:rFonts w:ascii="Wingdings" w:hAnsi="Wingdings" w:hint="default"/>
+        <w:sz w:val="20"/>
+      </w:rPr>
+    </w:lvl>
+  </w:abstractNum>
+  <w:num w:numId="1" w16cid:durableId="1002854871">
+    <w:abstractNumId w:val="6"/>
+  </w:num>
+  <w:num w:numId="2" w16cid:durableId="2123643822">
+    <w:abstractNumId w:val="0"/>
+  </w:num>
+  <w:num w:numId="3" w16cid:durableId="1859922680">
+    <w:abstractNumId w:val="2"/>
+  </w:num>
+  <w:num w:numId="4" w16cid:durableId="610821465">
+    <w:abstractNumId w:val="4"/>
+  </w:num>
+  <w:num w:numId="5" w16cid:durableId="453985958">
+    <w:abstractNumId w:val="1"/>
+  </w:num>
+  <w:num w:numId="6" w16cid:durableId="236522286">
+    <w:abstractNumId w:val="5"/>
+  </w:num>
+  <w:num w:numId="7" w16cid:durableId="1877573277">
+    <w:abstractNumId w:val="3"/>
+  </w:num>
+</w:numbering>
 </file>
 
 <file path=word/styles.xml><?xml version="1.0" encoding="utf-8"?>
@@ -714,6 +4646,7 @@
   <w:style w:type="character" w:default="1" w:styleId="Fontepargpadro">
     <w:name w:val="Default Paragraph Font"/>
     <w:uiPriority w:val="1"/>
+    <w:semiHidden/>
     <w:unhideWhenUsed/>
   </w:style>
   <w:style w:type="table" w:default="1" w:styleId="Tabelanormal">

</xml_diff>